<commit_message>
Remove note about replication.
</commit_message>
<xml_diff>
--- a/Косенко_НИ_Рецензия.docx
+++ b/Косенко_НИ_Рецензия.docx
@@ -23,10 +23,15 @@
           <w:b/>
         </w:rPr>
       </w:r>
+      <w:r>
+        <w:rPr>
+          <w:b/>
+        </w:rPr>
+      </w:r>
     </w:p>
     <w:p>
       <w:pPr>
-        <w:pStyle w:val="668"/>
+        <w:pStyle w:val="891"/>
         <w:pBdr/>
         <w:spacing w:after="0" w:afterAutospacing="0" w:before="0" w:beforeAutospacing="0"/>
         <w:ind/>
@@ -56,6 +61,13 @@
           <w:bCs/>
         </w:rPr>
       </w:r>
+      <w:r>
+        <w:rPr>
+          <w:rFonts w:ascii="Times New Roman CYR" w:hAnsi="Times New Roman CYR"/>
+          <w:b/>
+          <w:bCs/>
+        </w:rPr>
+      </w:r>
     </w:p>
     <w:p>
       <w:pPr>
@@ -69,6 +81,13 @@
           <w:bCs/>
         </w:rPr>
       </w:pPr>
+      <w:r>
+        <w:rPr>
+          <w:rFonts w:ascii="Times New Roman CYR" w:hAnsi="Times New Roman CYR"/>
+          <w:b/>
+          <w:bCs/>
+        </w:rPr>
+      </w:r>
       <w:r>
         <w:rPr>
           <w:rFonts w:ascii="Times New Roman CYR" w:hAnsi="Times New Roman CYR"/>
@@ -118,6 +137,15 @@
           <w:szCs w:val="28"/>
         </w:rPr>
       </w:r>
+      <w:r>
+        <w:rPr>
+          <w:rFonts w:ascii="Times New Roman CYR" w:hAnsi="Times New Roman CYR"/>
+          <w:b/>
+          <w:bCs/>
+          <w:sz w:val="28"/>
+          <w:szCs w:val="28"/>
+        </w:rPr>
+      </w:r>
     </w:p>
     <w:p>
       <w:pPr>
@@ -138,6 +166,13 @@
           <w:bCs/>
         </w:rPr>
         <w:t xml:space="preserve">на тему</w:t>
+      </w:r>
+      <w:r>
+        <w:rPr>
+          <w:rFonts w:ascii="Times New Roman CYR" w:hAnsi="Times New Roman CYR"/>
+          <w:b/>
+          <w:bCs/>
+        </w:rPr>
       </w:r>
       <w:r>
         <w:rPr>
@@ -197,6 +232,12 @@
           <w:szCs w:val="28"/>
         </w:rPr>
       </w:r>
+      <w:r>
+        <w:rPr>
+          <w:b/>
+          <w:bCs/>
+        </w:rPr>
+      </w:r>
     </w:p>
     <w:p>
       <w:pPr>
@@ -234,6 +275,12 @@
       </w:r>
       <w:r>
         <w:rPr>
+          <w:b/>
+          <w:bCs/>
+        </w:rPr>
+      </w:r>
+      <w:r>
+        <w:rPr>
           <w:rFonts w:ascii="Times New Roman CYR" w:hAnsi="Times New Roman CYR"/>
           <w:b/>
           <w:bCs/>
@@ -241,12 +288,6 @@
           <w:szCs w:val="28"/>
         </w:rPr>
       </w:r>
-      <w:r>
-        <w:rPr>
-          <w:b/>
-          <w:bCs/>
-        </w:rPr>
-      </w:r>
     </w:p>
     <w:p>
       <w:pPr>
@@ -259,6 +300,12 @@
           <w:bCs/>
         </w:rPr>
       </w:pPr>
+      <w:r>
+        <w:rPr>
+          <w:rFonts w:ascii="Times New Roman CYR" w:hAnsi="Times New Roman CYR"/>
+          <w:bCs/>
+        </w:rPr>
+      </w:r>
       <w:r>
         <w:rPr>
           <w:rFonts w:ascii="Times New Roman CYR" w:hAnsi="Times New Roman CYR"/>
@@ -312,6 +359,12 @@
           <w:szCs w:val="28"/>
         </w:rPr>
         <w:t xml:space="preserve">.</w:t>
+      </w:r>
+      <w:r>
+        <w:rPr>
+          <w:sz w:val="28"/>
+          <w:szCs w:val="28"/>
+        </w:rPr>
       </w:r>
       <w:r>
         <w:rPr>
@@ -372,6 +425,12 @@
           <w:szCs w:val="28"/>
         </w:rPr>
       </w:r>
+      <w:r>
+        <w:rPr>
+          <w:sz w:val="28"/>
+          <w:szCs w:val="28"/>
+        </w:rPr>
+      </w:r>
     </w:p>
     <w:p>
       <w:pPr>
@@ -411,7 +470,14 @@
           <w:sz w:val="28"/>
           <w:szCs w:val="28"/>
         </w:rPr>
-        <w:t xml:space="preserve">, проводится анализ особенностей хранения данных, порождающих замедление исполнения запросов. Также проводится сравнительный анализ альтернативных вариантов хранения кортежей, проводятся исследование даваемого ими прироста производительности. Для определения подходящих способов реализации проводится анализ существующих инструментов для написания расширений для </w:t>
+        <w:t xml:space="preserve">, проводится анализ особенностей хранения данных, порождающих замедление исполнения запросов. Также проводи</w:t>
+      </w:r>
+      <w:r>
+        <w:rPr>
+          <w:sz w:val="28"/>
+          <w:szCs w:val="28"/>
+        </w:rPr>
+        <w:t xml:space="preserve">тся сравнительный анализ альтернативных вариантов хранения кортежей, проводятся исследование даваемого ими прироста производительности. Для определения подходящих способов реализации проводится анализ существующих инструментов для написания расширений для </w:t>
       </w:r>
       <w:r>
         <w:rPr>
@@ -420,6 +486,12 @@
           <w:lang w:val="en-US"/>
         </w:rPr>
         <w:t xml:space="preserve">PostgreSQL.</w:t>
+      </w:r>
+      <w:r>
+        <w:rPr>
+          <w:sz w:val="28"/>
+          <w:szCs w:val="28"/>
+        </w:rPr>
       </w:r>
       <w:r>
         <w:rPr>
@@ -491,6 +563,12 @@
           <w:szCs w:val="28"/>
         </w:rPr>
       </w:r>
+      <w:r>
+        <w:rPr>
+          <w:sz w:val="28"/>
+          <w:szCs w:val="28"/>
+        </w:rPr>
+      </w:r>
     </w:p>
     <w:p>
       <w:pPr>
@@ -522,7 +600,14 @@
         </w:rPr>
         <w:t xml:space="preserve">В ней описывается модульная структура проекта, основные типы и функции, используемые при работе метода доступа. Также приводится описание процесса сборки и запуска расширения совместно с сервером СУБД.</w:t>
       </w:r>
-      <w:r/>
+      <w:r>
+        <w:rPr>
+          <w:sz w:val="28"/>
+          <w:szCs w:val="28"/>
+          <w:highlight w:val="none"/>
+          <w14:ligatures w14:val="none"/>
+        </w:rPr>
+      </w:r>
     </w:p>
     <w:p>
       <w:pPr>
@@ -540,7 +625,15 @@
           <w:szCs w:val="28"/>
           <w:highlight w:val="none"/>
         </w:rPr>
-        <w:t xml:space="preserve">В четвертой главе описывается программная реализация разработанной библиотеки-расширения,приводятся примеры ее применения для хранения кортежей и работы при сбое работы сервера. Также приводятся результаты нагрузочного тестирования, на основании которого делаются выводы о полученном приросте производительности.</w:t>
+        <w:t xml:space="preserve">В четвертой главе описывается программная реализация раз</w:t>
+      </w:r>
+      <w:r>
+        <w:rPr>
+          <w:sz w:val="28"/>
+          <w:szCs w:val="28"/>
+          <w:highlight w:val="none"/>
+        </w:rPr>
+        <w:t xml:space="preserve">работанной библиотеки-расширения,приводятся примеры ее применения для хранения кортежей и работы при сбое работы сервера. Также приводятся результаты нагрузочного тестирования, на основании которого делаются выводы о полученном приросте производительности.</w:t>
       </w:r>
       <w:r>
         <w:rPr>
@@ -551,9 +644,7 @@
       </w:r>
       <w:r>
         <w:rPr>
-          <w:sz w:val="28"/>
-          <w:szCs w:val="28"/>
-          <w:highlight w:val="none"/>
+          <w14:ligatures w14:val="none"/>
         </w:rPr>
       </w:r>
     </w:p>
@@ -609,6 +700,12 @@
           <w:highlight w:val="none"/>
         </w:rPr>
       </w:r>
+      <w:r>
+        <w:rPr>
+          <w:sz w:val="28"/>
+          <w:szCs w:val="28"/>
+        </w:rPr>
+      </w:r>
     </w:p>
     <w:p>
       <w:pPr>
@@ -627,15 +724,7 @@
           <w:sz w:val="28"/>
           <w:szCs w:val="28"/>
         </w:rPr>
-        <w:t xml:space="preserve">Из недостатков работы следует отметить отсутствие в конечной реализации нужного для репликации таблиц взаимодействия с журналом предзаписи </w:t>
-      </w:r>
-      <w:r>
-        <w:rPr>
-          <w:sz w:val="28"/>
-          <w:szCs w:val="28"/>
-          <w:lang w:val="en-US"/>
-        </w:rPr>
-        <w:t xml:space="preserve">PostgreSQL, </w:t>
+        <w:t xml:space="preserve">Из недостатков работы следует отметить</w:t>
       </w:r>
       <w:r>
         <w:rPr>
@@ -643,7 +732,7 @@
           <w:szCs w:val="28"/>
           <w:lang w:val="ru-RU"/>
         </w:rPr>
-        <w:t xml:space="preserve">а также отсутствие дробления больших кортежей на </w:t>
+        <w:t xml:space="preserve"> отсутствие дробления больших кортежей на </w:t>
       </w:r>
       <w:r>
         <w:rPr>
@@ -660,13 +749,6 @@
           <w:lang w:val="ru-RU"/>
         </w:rPr>
         <w:t xml:space="preserve">-таблицы и обеспечения уровня изолированности транзакций  </w:t>
-      </w:r>
-      <w:r>
-        <w:rPr>
-          <w:sz w:val="28"/>
-          <w:szCs w:val="28"/>
-          <w:lang w:val="en-US"/>
-        </w:rPr>
       </w:r>
       <w:r>
         <w:rPr>
@@ -696,6 +778,13 @@
         <w:rPr>
           <w:sz w:val="28"/>
           <w:szCs w:val="28"/>
+        </w:rPr>
+      </w:r>
+      <w:r>
+        <w:rPr>
+          <w:sz w:val="28"/>
+          <w:szCs w:val="28"/>
+          <w:highlight w:val="none"/>
         </w:rPr>
       </w:r>
     </w:p>
@@ -843,6 +932,12 @@
           <w:szCs w:val="28"/>
         </w:rPr>
       </w:r>
+      <w:r>
+        <w:rPr>
+          <w:sz w:val="28"/>
+          <w:szCs w:val="28"/>
+        </w:rPr>
+      </w:r>
     </w:p>
     <w:p>
       <w:pPr>
@@ -855,6 +950,12 @@
           <w:bCs/>
         </w:rPr>
       </w:pPr>
+      <w:r>
+        <w:rPr>
+          <w:rFonts w:ascii="Times New Roman CYR" w:hAnsi="Times New Roman CYR"/>
+          <w:bCs/>
+        </w:rPr>
+      </w:r>
       <w:r>
         <w:rPr>
           <w:rFonts w:ascii="Times New Roman CYR" w:hAnsi="Times New Roman CYR"/>
@@ -879,6 +980,12 @@
           <w:bCs/>
         </w:rPr>
       </w:pPr>
+      <w:r>
+        <w:rPr>
+          <w:rFonts w:ascii="Times New Roman CYR" w:hAnsi="Times New Roman CYR"/>
+          <w:bCs/>
+        </w:rPr>
+      </w:r>
       <w:r>
         <w:rPr>
           <w:rFonts w:ascii="Times New Roman CYR" w:hAnsi="Times New Roman CYR"/>
@@ -930,22 +1037,6 @@
           <w:szCs w:val="28"/>
         </w:rPr>
       </w:r>
-      <w:r>
-        <w:rPr>
-          <w:rFonts w:ascii="Times New Roman CYR" w:hAnsi="Times New Roman CYR"/>
-          <w:bCs/>
-          <w:sz w:val="28"/>
-          <w:szCs w:val="28"/>
-        </w:rPr>
-      </w:r>
-      <w:r>
-        <w:rPr>
-          <w:rFonts w:ascii="Times New Roman CYR" w:hAnsi="Times New Roman CYR"/>
-          <w:bCs/>
-          <w:sz w:val="28"/>
-          <w:szCs w:val="28"/>
-        </w:rPr>
-      </w:r>
     </w:p>
     <w:p>
       <w:pPr>
@@ -976,6 +1067,14 @@
           <w:bCs/>
           <w:sz w:val="28"/>
           <w:szCs w:val="28"/>
+        </w:rPr>
+      </w:r>
+      <w:r>
+        <w:rPr>
+          <w:rFonts w:ascii="Times New Roman CYR" w:hAnsi="Times New Roman CYR"/>
+          <w:sz w:val="28"/>
+          <w:szCs w:val="28"/>
+          <w:highlight w:val="none"/>
         </w:rPr>
       </w:r>
     </w:p>
@@ -1044,10 +1143,8 @@
       <w:r>
         <w:rPr>
           <w:rFonts w:ascii="Times New Roman CYR" w:hAnsi="Times New Roman CYR"/>
-          <w:bCs/>
           <w:sz w:val="28"/>
           <w:szCs w:val="28"/>
-          <w:highlight w:val="white"/>
         </w:rPr>
       </w:r>
       <w:r>
@@ -1055,6 +1152,7 @@
           <w:rFonts w:ascii="Times New Roman CYR" w:hAnsi="Times New Roman CYR"/>
           <w:sz w:val="28"/>
           <w:szCs w:val="28"/>
+          <w:highlight w:val="white"/>
         </w:rPr>
       </w:r>
     </w:p>
@@ -1125,7 +1223,13 @@
           <w:szCs w:val="28"/>
         </w:rPr>
       </w:r>
-      <w:r/>
+      <w:r>
+        <w:rPr>
+          <w:rFonts w:ascii="Times New Roman CYR" w:hAnsi="Times New Roman CYR"/>
+          <w:sz w:val="28"/>
+          <w:szCs w:val="28"/>
+        </w:rPr>
+      </w:r>
     </w:p>
     <w:p>
       <w:pPr>
@@ -1160,10 +1264,8 @@
       <w:r>
         <w:rPr>
           <w:rFonts w:ascii="Times New Roman CYR" w:hAnsi="Times New Roman CYR"/>
-          <w:bCs/>
           <w:sz w:val="28"/>
           <w:szCs w:val="28"/>
-          <w:highlight w:val="none"/>
         </w:rPr>
       </w:r>
     </w:p>
@@ -1201,7 +1303,6 @@
       <w:r>
         <w:rPr>
           <w:rFonts w:ascii="Times New Roman CYR" w:hAnsi="Times New Roman CYR"/>
-          <w:bCs/>
           <w:sz w:val="28"/>
           <w:szCs w:val="28"/>
           <w:highlight w:val="none"/>
@@ -1296,8 +1397,14 @@
         </w:rPr>
         <w:t xml:space="preserve">Густун/</w:t>
       </w:r>
-      <w:r/>
-      <w:r/>
+      <w:r>
+        <w:rPr>
+          <w:rFonts w:ascii="Times New Roman CYR" w:hAnsi="Times New Roman CYR"/>
+          <w:sz w:val="28"/>
+          <w:szCs w:val="28"/>
+          <w:highlight w:val="none"/>
+        </w:rPr>
+      </w:r>
     </w:p>
     <w:p>
       <w:pPr>
@@ -1356,6 +1463,14 @@
           <w:szCs w:val="20"/>
         </w:rPr>
       </w:r>
+      <w:r>
+        <w:rPr>
+          <w:rFonts w:ascii="Times New Roman CYR" w:hAnsi="Times New Roman CYR"/>
+          <w:bCs/>
+          <w:sz w:val="20"/>
+          <w:szCs w:val="20"/>
+        </w:rPr>
+      </w:r>
     </w:p>
     <w:p>
       <w:pPr>
@@ -1368,6 +1483,12 @@
           <w:bCs/>
         </w:rPr>
       </w:pPr>
+      <w:r>
+        <w:rPr>
+          <w:rFonts w:ascii="Times New Roman CYR" w:hAnsi="Times New Roman CYR"/>
+          <w:bCs/>
+        </w:rPr>
+      </w:r>
       <w:r>
         <w:rPr>
           <w:rFonts w:ascii="Times New Roman CYR" w:hAnsi="Times New Roman CYR"/>
@@ -1403,7 +1524,6 @@
         <w:ind/>
         <w:rPr/>
       </w:pPr>
-      <w:r/>
       <w:r>
         <w:separator/>
       </w:r>
@@ -1418,7 +1538,6 @@
         <w:ind/>
         <w:rPr/>
       </w:pPr>
-      <w:r/>
       <w:r>
         <w:continuationSeparator/>
       </w:r>
@@ -1438,7 +1557,6 @@
         <w:ind/>
         <w:rPr/>
       </w:pPr>
-      <w:r/>
       <w:r>
         <w:separator/>
       </w:r>
@@ -1453,7 +1571,6 @@
         <w:ind/>
         <w:rPr/>
       </w:pPr>
-      <w:r/>
       <w:r>
         <w:continuationSeparator/>
       </w:r>
@@ -1619,9 +1736,9 @@
     <w:lsdException w:name="Bibliography" w:uiPriority="37"/>
     <w:lsdException w:name="TOC Heading" w:uiPriority="39" w:qFormat="1"/>
   </w:latentStyles>
-  <w:style w:type="table" w:styleId="12">
+  <w:style w:type="table" w:styleId="701">
     <w:name w:val="Table Grid"/>
-    <w:basedOn w:val="666"/>
+    <w:basedOn w:val="889"/>
     <w:uiPriority w:val="59"/>
     <w:pPr>
       <w:pBdr/>
@@ -1818,9 +1935,9 @@
       </w:tcPr>
     </w:tblStylePr>
   </w:style>
-  <w:style w:type="table" w:styleId="13">
+  <w:style w:type="table" w:styleId="702">
     <w:name w:val="Table Grid Light"/>
-    <w:basedOn w:val="666"/>
+    <w:basedOn w:val="889"/>
     <w:uiPriority w:val="59"/>
     <w:pPr>
       <w:pBdr/>
@@ -2017,9 +2134,9 @@
       </w:tcPr>
     </w:tblStylePr>
   </w:style>
-  <w:style w:type="table" w:styleId="14">
+  <w:style w:type="table" w:styleId="703">
     <w:name w:val="Plain Table 1"/>
-    <w:basedOn w:val="666"/>
+    <w:basedOn w:val="889"/>
     <w:uiPriority w:val="59"/>
     <w:pPr>
       <w:pBdr/>
@@ -2242,9 +2359,9 @@
       </w:tcPr>
     </w:tblStylePr>
   </w:style>
-  <w:style w:type="table" w:styleId="15">
+  <w:style w:type="table" w:styleId="704">
     <w:name w:val="Plain Table 2"/>
-    <w:basedOn w:val="666"/>
+    <w:basedOn w:val="889"/>
     <w:uiPriority w:val="59"/>
     <w:pPr>
       <w:pBdr/>
@@ -2475,9 +2592,9 @@
       </w:tcPr>
     </w:tblStylePr>
   </w:style>
-  <w:style w:type="table" w:styleId="16">
+  <w:style w:type="table" w:styleId="705">
     <w:name w:val="Plain Table 3"/>
-    <w:basedOn w:val="666"/>
+    <w:basedOn w:val="889"/>
     <w:uiPriority w:val="99"/>
     <w:pPr>
       <w:pBdr/>
@@ -2705,9 +2822,9 @@
       </w:tcPr>
     </w:tblStylePr>
   </w:style>
-  <w:style w:type="table" w:styleId="17">
+  <w:style w:type="table" w:styleId="706">
     <w:name w:val="Plain Table 4"/>
-    <w:basedOn w:val="666"/>
+    <w:basedOn w:val="889"/>
     <w:uiPriority w:val="99"/>
     <w:pPr>
       <w:pBdr/>
@@ -2921,9 +3038,9 @@
       </w:tcPr>
     </w:tblStylePr>
   </w:style>
-  <w:style w:type="table" w:styleId="18">
+  <w:style w:type="table" w:styleId="707">
     <w:name w:val="Plain Table 5"/>
-    <w:basedOn w:val="666"/>
+    <w:basedOn w:val="889"/>
     <w:uiPriority w:val="99"/>
     <w:pPr>
       <w:pBdr/>
@@ -3154,9 +3271,9 @@
       </w:tcPr>
     </w:tblStylePr>
   </w:style>
-  <w:style w:type="table" w:styleId="19">
+  <w:style w:type="table" w:styleId="708">
     <w:name w:val="Grid Table 1 Light"/>
-    <w:basedOn w:val="666"/>
+    <w:basedOn w:val="889"/>
     <w:uiPriority w:val="99"/>
     <w:pPr>
       <w:pBdr/>
@@ -3377,9 +3494,9 @@
       </w:tcPr>
     </w:tblStylePr>
   </w:style>
-  <w:style w:type="table" w:styleId="20">
+  <w:style w:type="table" w:styleId="709">
     <w:name w:val="Grid Table 1 Light - Accent 1"/>
-    <w:basedOn w:val="666"/>
+    <w:basedOn w:val="889"/>
     <w:uiPriority w:val="99"/>
     <w:pPr>
       <w:pBdr/>
@@ -3600,9 +3717,9 @@
       </w:tcPr>
     </w:tblStylePr>
   </w:style>
-  <w:style w:type="table" w:styleId="21">
+  <w:style w:type="table" w:styleId="710">
     <w:name w:val="Grid Table 1 Light - Accent 2"/>
-    <w:basedOn w:val="666"/>
+    <w:basedOn w:val="889"/>
     <w:uiPriority w:val="99"/>
     <w:pPr>
       <w:pBdr/>
@@ -3823,9 +3940,9 @@
       </w:tcPr>
     </w:tblStylePr>
   </w:style>
-  <w:style w:type="table" w:styleId="22">
+  <w:style w:type="table" w:styleId="711">
     <w:name w:val="Grid Table 1 Light - Accent 3"/>
-    <w:basedOn w:val="666"/>
+    <w:basedOn w:val="889"/>
     <w:uiPriority w:val="99"/>
     <w:pPr>
       <w:pBdr/>
@@ -4046,9 +4163,9 @@
       </w:tcPr>
     </w:tblStylePr>
   </w:style>
-  <w:style w:type="table" w:styleId="23">
+  <w:style w:type="table" w:styleId="712">
     <w:name w:val="Grid Table 1 Light - Accent 4"/>
-    <w:basedOn w:val="666"/>
+    <w:basedOn w:val="889"/>
     <w:uiPriority w:val="99"/>
     <w:pPr>
       <w:pBdr/>
@@ -4269,9 +4386,9 @@
       </w:tcPr>
     </w:tblStylePr>
   </w:style>
-  <w:style w:type="table" w:styleId="24">
+  <w:style w:type="table" w:styleId="713">
     <w:name w:val="Grid Table 1 Light - Accent 5"/>
-    <w:basedOn w:val="666"/>
+    <w:basedOn w:val="889"/>
     <w:uiPriority w:val="99"/>
     <w:pPr>
       <w:pBdr/>
@@ -4492,9 +4609,9 @@
       </w:tcPr>
     </w:tblStylePr>
   </w:style>
-  <w:style w:type="table" w:styleId="25">
+  <w:style w:type="table" w:styleId="714">
     <w:name w:val="Grid Table 1 Light - Accent 6"/>
-    <w:basedOn w:val="666"/>
+    <w:basedOn w:val="889"/>
     <w:uiPriority w:val="99"/>
     <w:pPr>
       <w:pBdr/>
@@ -4715,9 +4832,9 @@
       </w:tcPr>
     </w:tblStylePr>
   </w:style>
-  <w:style w:type="table" w:styleId="26">
+  <w:style w:type="table" w:styleId="715">
     <w:name w:val="Grid Table 2"/>
-    <w:basedOn w:val="666"/>
+    <w:basedOn w:val="889"/>
     <w:uiPriority w:val="99"/>
     <w:pPr>
       <w:pBdr/>
@@ -4947,9 +5064,9 @@
       </w:tcPr>
     </w:tblStylePr>
   </w:style>
-  <w:style w:type="table" w:styleId="27">
+  <w:style w:type="table" w:styleId="716">
     <w:name w:val="Grid Table 2 - Accent 1"/>
-    <w:basedOn w:val="666"/>
+    <w:basedOn w:val="889"/>
     <w:uiPriority w:val="99"/>
     <w:pPr>
       <w:pBdr/>
@@ -5179,9 +5296,9 @@
       </w:tcPr>
     </w:tblStylePr>
   </w:style>
-  <w:style w:type="table" w:styleId="28">
+  <w:style w:type="table" w:styleId="717">
     <w:name w:val="Grid Table 2 - Accent 2"/>
-    <w:basedOn w:val="666"/>
+    <w:basedOn w:val="889"/>
     <w:uiPriority w:val="99"/>
     <w:pPr>
       <w:pBdr/>
@@ -5411,9 +5528,9 @@
       </w:tcPr>
     </w:tblStylePr>
   </w:style>
-  <w:style w:type="table" w:styleId="29">
+  <w:style w:type="table" w:styleId="718">
     <w:name w:val="Grid Table 2 - Accent 3"/>
-    <w:basedOn w:val="666"/>
+    <w:basedOn w:val="889"/>
     <w:uiPriority w:val="99"/>
     <w:pPr>
       <w:pBdr/>
@@ -5643,9 +5760,9 @@
       </w:tcPr>
     </w:tblStylePr>
   </w:style>
-  <w:style w:type="table" w:styleId="30">
+  <w:style w:type="table" w:styleId="719">
     <w:name w:val="Grid Table 2 - Accent 4"/>
-    <w:basedOn w:val="666"/>
+    <w:basedOn w:val="889"/>
     <w:uiPriority w:val="99"/>
     <w:pPr>
       <w:pBdr/>
@@ -5875,9 +5992,9 @@
       </w:tcPr>
     </w:tblStylePr>
   </w:style>
-  <w:style w:type="table" w:styleId="31">
+  <w:style w:type="table" w:styleId="720">
     <w:name w:val="Grid Table 2 - Accent 5"/>
-    <w:basedOn w:val="666"/>
+    <w:basedOn w:val="889"/>
     <w:uiPriority w:val="99"/>
     <w:pPr>
       <w:pBdr/>
@@ -6107,9 +6224,9 @@
       </w:tcPr>
     </w:tblStylePr>
   </w:style>
-  <w:style w:type="table" w:styleId="32">
+  <w:style w:type="table" w:styleId="721">
     <w:name w:val="Grid Table 2 - Accent 6"/>
-    <w:basedOn w:val="666"/>
+    <w:basedOn w:val="889"/>
     <w:uiPriority w:val="99"/>
     <w:pPr>
       <w:pBdr/>
@@ -6339,9 +6456,9 @@
       </w:tcPr>
     </w:tblStylePr>
   </w:style>
-  <w:style w:type="table" w:styleId="33">
+  <w:style w:type="table" w:styleId="722">
     <w:name w:val="Grid Table 3"/>
-    <w:basedOn w:val="666"/>
+    <w:basedOn w:val="889"/>
     <w:uiPriority w:val="99"/>
     <w:pPr>
       <w:pBdr/>
@@ -6440,29 +6557,6 @@
         <w:tblBorders/>
       </w:tblPr>
       <w:tcPr>
-        <w:shd w:color="ffffff"/>
-        <w:tcBorders>
-          <w:top w:val="none" w:color="000000" w:sz="4" w:space="0"/>
-          <w:left w:val="none" w:color="000000" w:sz="4" w:space="0"/>
-          <w:bottom w:val="none" w:color="000000" w:sz="4" w:space="0"/>
-          <w:right w:val="none" w:color="000000" w:sz="4" w:space="0"/>
-        </w:tcBorders>
-      </w:tcPr>
-    </w:tblStylePr>
-    <w:tblStylePr w:type="firstRow">
-      <w:rPr>
-        <w:b/>
-        <w:color w:val="404040"/>
-      </w:rPr>
-      <w:pPr>
-        <w:pBdr/>
-        <w:spacing/>
-        <w:ind/>
-      </w:pPr>
-      <w:tblPr>
-        <w:tblBorders/>
-      </w:tblPr>
-      <w:tcPr>
         <w:shd w:val="clear" w:color="ffffff"/>
         <w:tcBorders>
           <w:top w:val="none" w:color="000000" w:sz="4" w:space="0"/>
@@ -6472,30 +6566,7 @@
         </w:tcBorders>
       </w:tcPr>
     </w:tblStylePr>
-    <w:tblStylePr w:type="lastCol">
-      <w:rPr>
-        <w:i/>
-        <w:color w:val="404040"/>
-      </w:rPr>
-      <w:pPr>
-        <w:pBdr/>
-        <w:spacing/>
-        <w:ind/>
-      </w:pPr>
-      <w:tblPr>
-        <w:tblBorders/>
-      </w:tblPr>
-      <w:tcPr>
-        <w:shd w:color="ffffff"/>
-        <w:tcBorders>
-          <w:top w:val="none" w:color="000000" w:sz="4" w:space="0"/>
-          <w:left w:val="none" w:color="000000" w:sz="4" w:space="0"/>
-          <w:bottom w:val="none" w:color="000000" w:sz="4" w:space="0"/>
-          <w:right w:val="none" w:color="000000" w:sz="4" w:space="0"/>
-        </w:tcBorders>
-      </w:tcPr>
-    </w:tblStylePr>
-    <w:tblStylePr w:type="lastRow">
+    <w:tblStylePr w:type="firstRow">
       <w:rPr>
         <w:b/>
         <w:color w:val="404040"/>
@@ -6518,6 +6589,52 @@
         </w:tcBorders>
       </w:tcPr>
     </w:tblStylePr>
+    <w:tblStylePr w:type="lastCol">
+      <w:rPr>
+        <w:i/>
+        <w:color w:val="404040"/>
+      </w:rPr>
+      <w:pPr>
+        <w:pBdr/>
+        <w:spacing/>
+        <w:ind/>
+      </w:pPr>
+      <w:tblPr>
+        <w:tblBorders/>
+      </w:tblPr>
+      <w:tcPr>
+        <w:shd w:val="clear" w:color="ffffff"/>
+        <w:tcBorders>
+          <w:top w:val="none" w:color="000000" w:sz="4" w:space="0"/>
+          <w:left w:val="none" w:color="000000" w:sz="4" w:space="0"/>
+          <w:bottom w:val="none" w:color="000000" w:sz="4" w:space="0"/>
+          <w:right w:val="none" w:color="000000" w:sz="4" w:space="0"/>
+        </w:tcBorders>
+      </w:tcPr>
+    </w:tblStylePr>
+    <w:tblStylePr w:type="lastRow">
+      <w:rPr>
+        <w:b/>
+        <w:color w:val="404040"/>
+      </w:rPr>
+      <w:pPr>
+        <w:pBdr/>
+        <w:spacing/>
+        <w:ind/>
+      </w:pPr>
+      <w:tblPr>
+        <w:tblBorders/>
+      </w:tblPr>
+      <w:tcPr>
+        <w:shd w:val="clear" w:color="ffffff"/>
+        <w:tcBorders>
+          <w:top w:val="none" w:color="000000" w:sz="4" w:space="0"/>
+          <w:left w:val="none" w:color="000000" w:sz="4" w:space="0"/>
+          <w:bottom w:val="none" w:color="000000" w:sz="4" w:space="0"/>
+          <w:right w:val="none" w:color="000000" w:sz="4" w:space="0"/>
+        </w:tcBorders>
+      </w:tcPr>
+    </w:tblStylePr>
     <w:tblStylePr w:type="nwCell">
       <w:pPr>
         <w:pBdr/>
@@ -6584,9 +6701,9 @@
       </w:tcPr>
     </w:tblStylePr>
   </w:style>
-  <w:style w:type="table" w:styleId="34">
+  <w:style w:type="table" w:styleId="723">
     <w:name w:val="Grid Table 3 - Accent 1"/>
-    <w:basedOn w:val="666"/>
+    <w:basedOn w:val="889"/>
     <w:uiPriority w:val="99"/>
     <w:pPr>
       <w:pBdr/>
@@ -6685,29 +6802,6 @@
         <w:tblBorders/>
       </w:tblPr>
       <w:tcPr>
-        <w:shd w:color="ffffff"/>
-        <w:tcBorders>
-          <w:top w:val="none" w:color="000000" w:sz="4" w:space="0"/>
-          <w:left w:val="none" w:color="000000" w:sz="4" w:space="0"/>
-          <w:bottom w:val="none" w:color="000000" w:sz="4" w:space="0"/>
-          <w:right w:val="none" w:color="000000" w:sz="4" w:space="0"/>
-        </w:tcBorders>
-      </w:tcPr>
-    </w:tblStylePr>
-    <w:tblStylePr w:type="firstRow">
-      <w:rPr>
-        <w:b/>
-        <w:color w:val="404040"/>
-      </w:rPr>
-      <w:pPr>
-        <w:pBdr/>
-        <w:spacing/>
-        <w:ind/>
-      </w:pPr>
-      <w:tblPr>
-        <w:tblBorders/>
-      </w:tblPr>
-      <w:tcPr>
         <w:shd w:val="clear" w:color="ffffff"/>
         <w:tcBorders>
           <w:top w:val="none" w:color="000000" w:sz="4" w:space="0"/>
@@ -6717,30 +6811,7 @@
         </w:tcBorders>
       </w:tcPr>
     </w:tblStylePr>
-    <w:tblStylePr w:type="lastCol">
-      <w:rPr>
-        <w:i/>
-        <w:color w:val="404040"/>
-      </w:rPr>
-      <w:pPr>
-        <w:pBdr/>
-        <w:spacing/>
-        <w:ind/>
-      </w:pPr>
-      <w:tblPr>
-        <w:tblBorders/>
-      </w:tblPr>
-      <w:tcPr>
-        <w:shd w:color="ffffff"/>
-        <w:tcBorders>
-          <w:top w:val="none" w:color="000000" w:sz="4" w:space="0"/>
-          <w:left w:val="none" w:color="000000" w:sz="4" w:space="0"/>
-          <w:bottom w:val="none" w:color="000000" w:sz="4" w:space="0"/>
-          <w:right w:val="none" w:color="000000" w:sz="4" w:space="0"/>
-        </w:tcBorders>
-      </w:tcPr>
-    </w:tblStylePr>
-    <w:tblStylePr w:type="lastRow">
+    <w:tblStylePr w:type="firstRow">
       <w:rPr>
         <w:b/>
         <w:color w:val="404040"/>
@@ -6763,6 +6834,52 @@
         </w:tcBorders>
       </w:tcPr>
     </w:tblStylePr>
+    <w:tblStylePr w:type="lastCol">
+      <w:rPr>
+        <w:i/>
+        <w:color w:val="404040"/>
+      </w:rPr>
+      <w:pPr>
+        <w:pBdr/>
+        <w:spacing/>
+        <w:ind/>
+      </w:pPr>
+      <w:tblPr>
+        <w:tblBorders/>
+      </w:tblPr>
+      <w:tcPr>
+        <w:shd w:val="clear" w:color="ffffff"/>
+        <w:tcBorders>
+          <w:top w:val="none" w:color="000000" w:sz="4" w:space="0"/>
+          <w:left w:val="none" w:color="000000" w:sz="4" w:space="0"/>
+          <w:bottom w:val="none" w:color="000000" w:sz="4" w:space="0"/>
+          <w:right w:val="none" w:color="000000" w:sz="4" w:space="0"/>
+        </w:tcBorders>
+      </w:tcPr>
+    </w:tblStylePr>
+    <w:tblStylePr w:type="lastRow">
+      <w:rPr>
+        <w:b/>
+        <w:color w:val="404040"/>
+      </w:rPr>
+      <w:pPr>
+        <w:pBdr/>
+        <w:spacing/>
+        <w:ind/>
+      </w:pPr>
+      <w:tblPr>
+        <w:tblBorders/>
+      </w:tblPr>
+      <w:tcPr>
+        <w:shd w:val="clear" w:color="ffffff"/>
+        <w:tcBorders>
+          <w:top w:val="none" w:color="000000" w:sz="4" w:space="0"/>
+          <w:left w:val="none" w:color="000000" w:sz="4" w:space="0"/>
+          <w:bottom w:val="none" w:color="000000" w:sz="4" w:space="0"/>
+          <w:right w:val="none" w:color="000000" w:sz="4" w:space="0"/>
+        </w:tcBorders>
+      </w:tcPr>
+    </w:tblStylePr>
     <w:tblStylePr w:type="nwCell">
       <w:pPr>
         <w:pBdr/>
@@ -6829,9 +6946,9 @@
       </w:tcPr>
     </w:tblStylePr>
   </w:style>
-  <w:style w:type="table" w:styleId="35">
+  <w:style w:type="table" w:styleId="724">
     <w:name w:val="Grid Table 3 - Accent 2"/>
-    <w:basedOn w:val="666"/>
+    <w:basedOn w:val="889"/>
     <w:uiPriority w:val="99"/>
     <w:pPr>
       <w:pBdr/>
@@ -6930,29 +7047,6 @@
         <w:tblBorders/>
       </w:tblPr>
       <w:tcPr>
-        <w:shd w:color="ffffff"/>
-        <w:tcBorders>
-          <w:top w:val="none" w:color="000000" w:sz="4" w:space="0"/>
-          <w:left w:val="none" w:color="000000" w:sz="4" w:space="0"/>
-          <w:bottom w:val="none" w:color="000000" w:sz="4" w:space="0"/>
-          <w:right w:val="none" w:color="000000" w:sz="4" w:space="0"/>
-        </w:tcBorders>
-      </w:tcPr>
-    </w:tblStylePr>
-    <w:tblStylePr w:type="firstRow">
-      <w:rPr>
-        <w:b/>
-        <w:color w:val="404040"/>
-      </w:rPr>
-      <w:pPr>
-        <w:pBdr/>
-        <w:spacing/>
-        <w:ind/>
-      </w:pPr>
-      <w:tblPr>
-        <w:tblBorders/>
-      </w:tblPr>
-      <w:tcPr>
         <w:shd w:val="clear" w:color="ffffff"/>
         <w:tcBorders>
           <w:top w:val="none" w:color="000000" w:sz="4" w:space="0"/>
@@ -6962,30 +7056,7 @@
         </w:tcBorders>
       </w:tcPr>
     </w:tblStylePr>
-    <w:tblStylePr w:type="lastCol">
-      <w:rPr>
-        <w:i/>
-        <w:color w:val="404040"/>
-      </w:rPr>
-      <w:pPr>
-        <w:pBdr/>
-        <w:spacing/>
-        <w:ind/>
-      </w:pPr>
-      <w:tblPr>
-        <w:tblBorders/>
-      </w:tblPr>
-      <w:tcPr>
-        <w:shd w:color="ffffff"/>
-        <w:tcBorders>
-          <w:top w:val="none" w:color="000000" w:sz="4" w:space="0"/>
-          <w:left w:val="none" w:color="000000" w:sz="4" w:space="0"/>
-          <w:bottom w:val="none" w:color="000000" w:sz="4" w:space="0"/>
-          <w:right w:val="none" w:color="000000" w:sz="4" w:space="0"/>
-        </w:tcBorders>
-      </w:tcPr>
-    </w:tblStylePr>
-    <w:tblStylePr w:type="lastRow">
+    <w:tblStylePr w:type="firstRow">
       <w:rPr>
         <w:b/>
         <w:color w:val="404040"/>
@@ -7008,6 +7079,52 @@
         </w:tcBorders>
       </w:tcPr>
     </w:tblStylePr>
+    <w:tblStylePr w:type="lastCol">
+      <w:rPr>
+        <w:i/>
+        <w:color w:val="404040"/>
+      </w:rPr>
+      <w:pPr>
+        <w:pBdr/>
+        <w:spacing/>
+        <w:ind/>
+      </w:pPr>
+      <w:tblPr>
+        <w:tblBorders/>
+      </w:tblPr>
+      <w:tcPr>
+        <w:shd w:val="clear" w:color="ffffff"/>
+        <w:tcBorders>
+          <w:top w:val="none" w:color="000000" w:sz="4" w:space="0"/>
+          <w:left w:val="none" w:color="000000" w:sz="4" w:space="0"/>
+          <w:bottom w:val="none" w:color="000000" w:sz="4" w:space="0"/>
+          <w:right w:val="none" w:color="000000" w:sz="4" w:space="0"/>
+        </w:tcBorders>
+      </w:tcPr>
+    </w:tblStylePr>
+    <w:tblStylePr w:type="lastRow">
+      <w:rPr>
+        <w:b/>
+        <w:color w:val="404040"/>
+      </w:rPr>
+      <w:pPr>
+        <w:pBdr/>
+        <w:spacing/>
+        <w:ind/>
+      </w:pPr>
+      <w:tblPr>
+        <w:tblBorders/>
+      </w:tblPr>
+      <w:tcPr>
+        <w:shd w:val="clear" w:color="ffffff"/>
+        <w:tcBorders>
+          <w:top w:val="none" w:color="000000" w:sz="4" w:space="0"/>
+          <w:left w:val="none" w:color="000000" w:sz="4" w:space="0"/>
+          <w:bottom w:val="none" w:color="000000" w:sz="4" w:space="0"/>
+          <w:right w:val="none" w:color="000000" w:sz="4" w:space="0"/>
+        </w:tcBorders>
+      </w:tcPr>
+    </w:tblStylePr>
     <w:tblStylePr w:type="nwCell">
       <w:pPr>
         <w:pBdr/>
@@ -7074,9 +7191,9 @@
       </w:tcPr>
     </w:tblStylePr>
   </w:style>
-  <w:style w:type="table" w:styleId="36">
+  <w:style w:type="table" w:styleId="725">
     <w:name w:val="Grid Table 3 - Accent 3"/>
-    <w:basedOn w:val="666"/>
+    <w:basedOn w:val="889"/>
     <w:uiPriority w:val="99"/>
     <w:pPr>
       <w:pBdr/>
@@ -7175,29 +7292,6 @@
         <w:tblBorders/>
       </w:tblPr>
       <w:tcPr>
-        <w:shd w:color="ffffff"/>
-        <w:tcBorders>
-          <w:top w:val="none" w:color="000000" w:sz="4" w:space="0"/>
-          <w:left w:val="none" w:color="000000" w:sz="4" w:space="0"/>
-          <w:bottom w:val="none" w:color="000000" w:sz="4" w:space="0"/>
-          <w:right w:val="none" w:color="000000" w:sz="4" w:space="0"/>
-        </w:tcBorders>
-      </w:tcPr>
-    </w:tblStylePr>
-    <w:tblStylePr w:type="firstRow">
-      <w:rPr>
-        <w:b/>
-        <w:color w:val="404040"/>
-      </w:rPr>
-      <w:pPr>
-        <w:pBdr/>
-        <w:spacing/>
-        <w:ind/>
-      </w:pPr>
-      <w:tblPr>
-        <w:tblBorders/>
-      </w:tblPr>
-      <w:tcPr>
         <w:shd w:val="clear" w:color="ffffff"/>
         <w:tcBorders>
           <w:top w:val="none" w:color="000000" w:sz="4" w:space="0"/>
@@ -7207,30 +7301,7 @@
         </w:tcBorders>
       </w:tcPr>
     </w:tblStylePr>
-    <w:tblStylePr w:type="lastCol">
-      <w:rPr>
-        <w:i/>
-        <w:color w:val="404040"/>
-      </w:rPr>
-      <w:pPr>
-        <w:pBdr/>
-        <w:spacing/>
-        <w:ind/>
-      </w:pPr>
-      <w:tblPr>
-        <w:tblBorders/>
-      </w:tblPr>
-      <w:tcPr>
-        <w:shd w:color="ffffff"/>
-        <w:tcBorders>
-          <w:top w:val="none" w:color="000000" w:sz="4" w:space="0"/>
-          <w:left w:val="none" w:color="000000" w:sz="4" w:space="0"/>
-          <w:bottom w:val="none" w:color="000000" w:sz="4" w:space="0"/>
-          <w:right w:val="none" w:color="000000" w:sz="4" w:space="0"/>
-        </w:tcBorders>
-      </w:tcPr>
-    </w:tblStylePr>
-    <w:tblStylePr w:type="lastRow">
+    <w:tblStylePr w:type="firstRow">
       <w:rPr>
         <w:b/>
         <w:color w:val="404040"/>
@@ -7253,6 +7324,52 @@
         </w:tcBorders>
       </w:tcPr>
     </w:tblStylePr>
+    <w:tblStylePr w:type="lastCol">
+      <w:rPr>
+        <w:i/>
+        <w:color w:val="404040"/>
+      </w:rPr>
+      <w:pPr>
+        <w:pBdr/>
+        <w:spacing/>
+        <w:ind/>
+      </w:pPr>
+      <w:tblPr>
+        <w:tblBorders/>
+      </w:tblPr>
+      <w:tcPr>
+        <w:shd w:val="clear" w:color="ffffff"/>
+        <w:tcBorders>
+          <w:top w:val="none" w:color="000000" w:sz="4" w:space="0"/>
+          <w:left w:val="none" w:color="000000" w:sz="4" w:space="0"/>
+          <w:bottom w:val="none" w:color="000000" w:sz="4" w:space="0"/>
+          <w:right w:val="none" w:color="000000" w:sz="4" w:space="0"/>
+        </w:tcBorders>
+      </w:tcPr>
+    </w:tblStylePr>
+    <w:tblStylePr w:type="lastRow">
+      <w:rPr>
+        <w:b/>
+        <w:color w:val="404040"/>
+      </w:rPr>
+      <w:pPr>
+        <w:pBdr/>
+        <w:spacing/>
+        <w:ind/>
+      </w:pPr>
+      <w:tblPr>
+        <w:tblBorders/>
+      </w:tblPr>
+      <w:tcPr>
+        <w:shd w:val="clear" w:color="ffffff"/>
+        <w:tcBorders>
+          <w:top w:val="none" w:color="000000" w:sz="4" w:space="0"/>
+          <w:left w:val="none" w:color="000000" w:sz="4" w:space="0"/>
+          <w:bottom w:val="none" w:color="000000" w:sz="4" w:space="0"/>
+          <w:right w:val="none" w:color="000000" w:sz="4" w:space="0"/>
+        </w:tcBorders>
+      </w:tcPr>
+    </w:tblStylePr>
     <w:tblStylePr w:type="nwCell">
       <w:pPr>
         <w:pBdr/>
@@ -7319,9 +7436,9 @@
       </w:tcPr>
     </w:tblStylePr>
   </w:style>
-  <w:style w:type="table" w:styleId="37">
+  <w:style w:type="table" w:styleId="726">
     <w:name w:val="Grid Table 3 - Accent 4"/>
-    <w:basedOn w:val="666"/>
+    <w:basedOn w:val="889"/>
     <w:uiPriority w:val="99"/>
     <w:pPr>
       <w:pBdr/>
@@ -7420,29 +7537,6 @@
         <w:tblBorders/>
       </w:tblPr>
       <w:tcPr>
-        <w:shd w:color="ffffff"/>
-        <w:tcBorders>
-          <w:top w:val="none" w:color="000000" w:sz="4" w:space="0"/>
-          <w:left w:val="none" w:color="000000" w:sz="4" w:space="0"/>
-          <w:bottom w:val="none" w:color="000000" w:sz="4" w:space="0"/>
-          <w:right w:val="none" w:color="000000" w:sz="4" w:space="0"/>
-        </w:tcBorders>
-      </w:tcPr>
-    </w:tblStylePr>
-    <w:tblStylePr w:type="firstRow">
-      <w:rPr>
-        <w:b/>
-        <w:color w:val="404040"/>
-      </w:rPr>
-      <w:pPr>
-        <w:pBdr/>
-        <w:spacing/>
-        <w:ind/>
-      </w:pPr>
-      <w:tblPr>
-        <w:tblBorders/>
-      </w:tblPr>
-      <w:tcPr>
         <w:shd w:val="clear" w:color="ffffff"/>
         <w:tcBorders>
           <w:top w:val="none" w:color="000000" w:sz="4" w:space="0"/>
@@ -7452,30 +7546,7 @@
         </w:tcBorders>
       </w:tcPr>
     </w:tblStylePr>
-    <w:tblStylePr w:type="lastCol">
-      <w:rPr>
-        <w:i/>
-        <w:color w:val="404040"/>
-      </w:rPr>
-      <w:pPr>
-        <w:pBdr/>
-        <w:spacing/>
-        <w:ind/>
-      </w:pPr>
-      <w:tblPr>
-        <w:tblBorders/>
-      </w:tblPr>
-      <w:tcPr>
-        <w:shd w:color="ffffff"/>
-        <w:tcBorders>
-          <w:top w:val="none" w:color="000000" w:sz="4" w:space="0"/>
-          <w:left w:val="none" w:color="000000" w:sz="4" w:space="0"/>
-          <w:bottom w:val="none" w:color="000000" w:sz="4" w:space="0"/>
-          <w:right w:val="none" w:color="000000" w:sz="4" w:space="0"/>
-        </w:tcBorders>
-      </w:tcPr>
-    </w:tblStylePr>
-    <w:tblStylePr w:type="lastRow">
+    <w:tblStylePr w:type="firstRow">
       <w:rPr>
         <w:b/>
         <w:color w:val="404040"/>
@@ -7498,6 +7569,52 @@
         </w:tcBorders>
       </w:tcPr>
     </w:tblStylePr>
+    <w:tblStylePr w:type="lastCol">
+      <w:rPr>
+        <w:i/>
+        <w:color w:val="404040"/>
+      </w:rPr>
+      <w:pPr>
+        <w:pBdr/>
+        <w:spacing/>
+        <w:ind/>
+      </w:pPr>
+      <w:tblPr>
+        <w:tblBorders/>
+      </w:tblPr>
+      <w:tcPr>
+        <w:shd w:val="clear" w:color="ffffff"/>
+        <w:tcBorders>
+          <w:top w:val="none" w:color="000000" w:sz="4" w:space="0"/>
+          <w:left w:val="none" w:color="000000" w:sz="4" w:space="0"/>
+          <w:bottom w:val="none" w:color="000000" w:sz="4" w:space="0"/>
+          <w:right w:val="none" w:color="000000" w:sz="4" w:space="0"/>
+        </w:tcBorders>
+      </w:tcPr>
+    </w:tblStylePr>
+    <w:tblStylePr w:type="lastRow">
+      <w:rPr>
+        <w:b/>
+        <w:color w:val="404040"/>
+      </w:rPr>
+      <w:pPr>
+        <w:pBdr/>
+        <w:spacing/>
+        <w:ind/>
+      </w:pPr>
+      <w:tblPr>
+        <w:tblBorders/>
+      </w:tblPr>
+      <w:tcPr>
+        <w:shd w:val="clear" w:color="ffffff"/>
+        <w:tcBorders>
+          <w:top w:val="none" w:color="000000" w:sz="4" w:space="0"/>
+          <w:left w:val="none" w:color="000000" w:sz="4" w:space="0"/>
+          <w:bottom w:val="none" w:color="000000" w:sz="4" w:space="0"/>
+          <w:right w:val="none" w:color="000000" w:sz="4" w:space="0"/>
+        </w:tcBorders>
+      </w:tcPr>
+    </w:tblStylePr>
     <w:tblStylePr w:type="nwCell">
       <w:pPr>
         <w:pBdr/>
@@ -7564,9 +7681,9 @@
       </w:tcPr>
     </w:tblStylePr>
   </w:style>
-  <w:style w:type="table" w:styleId="38">
+  <w:style w:type="table" w:styleId="727">
     <w:name w:val="Grid Table 3 - Accent 5"/>
-    <w:basedOn w:val="666"/>
+    <w:basedOn w:val="889"/>
     <w:uiPriority w:val="99"/>
     <w:pPr>
       <w:pBdr/>
@@ -7665,29 +7782,6 @@
         <w:tblBorders/>
       </w:tblPr>
       <w:tcPr>
-        <w:shd w:color="ffffff"/>
-        <w:tcBorders>
-          <w:top w:val="none" w:color="000000" w:sz="4" w:space="0"/>
-          <w:left w:val="none" w:color="000000" w:sz="4" w:space="0"/>
-          <w:bottom w:val="none" w:color="000000" w:sz="4" w:space="0"/>
-          <w:right w:val="none" w:color="000000" w:sz="4" w:space="0"/>
-        </w:tcBorders>
-      </w:tcPr>
-    </w:tblStylePr>
-    <w:tblStylePr w:type="firstRow">
-      <w:rPr>
-        <w:b/>
-        <w:color w:val="404040"/>
-      </w:rPr>
-      <w:pPr>
-        <w:pBdr/>
-        <w:spacing/>
-        <w:ind/>
-      </w:pPr>
-      <w:tblPr>
-        <w:tblBorders/>
-      </w:tblPr>
-      <w:tcPr>
         <w:shd w:val="clear" w:color="ffffff"/>
         <w:tcBorders>
           <w:top w:val="none" w:color="000000" w:sz="4" w:space="0"/>
@@ -7697,30 +7791,7 @@
         </w:tcBorders>
       </w:tcPr>
     </w:tblStylePr>
-    <w:tblStylePr w:type="lastCol">
-      <w:rPr>
-        <w:i/>
-        <w:color w:val="404040"/>
-      </w:rPr>
-      <w:pPr>
-        <w:pBdr/>
-        <w:spacing/>
-        <w:ind/>
-      </w:pPr>
-      <w:tblPr>
-        <w:tblBorders/>
-      </w:tblPr>
-      <w:tcPr>
-        <w:shd w:color="ffffff"/>
-        <w:tcBorders>
-          <w:top w:val="none" w:color="000000" w:sz="4" w:space="0"/>
-          <w:left w:val="none" w:color="000000" w:sz="4" w:space="0"/>
-          <w:bottom w:val="none" w:color="000000" w:sz="4" w:space="0"/>
-          <w:right w:val="none" w:color="000000" w:sz="4" w:space="0"/>
-        </w:tcBorders>
-      </w:tcPr>
-    </w:tblStylePr>
-    <w:tblStylePr w:type="lastRow">
+    <w:tblStylePr w:type="firstRow">
       <w:rPr>
         <w:b/>
         <w:color w:val="404040"/>
@@ -7743,6 +7814,52 @@
         </w:tcBorders>
       </w:tcPr>
     </w:tblStylePr>
+    <w:tblStylePr w:type="lastCol">
+      <w:rPr>
+        <w:i/>
+        <w:color w:val="404040"/>
+      </w:rPr>
+      <w:pPr>
+        <w:pBdr/>
+        <w:spacing/>
+        <w:ind/>
+      </w:pPr>
+      <w:tblPr>
+        <w:tblBorders/>
+      </w:tblPr>
+      <w:tcPr>
+        <w:shd w:val="clear" w:color="ffffff"/>
+        <w:tcBorders>
+          <w:top w:val="none" w:color="000000" w:sz="4" w:space="0"/>
+          <w:left w:val="none" w:color="000000" w:sz="4" w:space="0"/>
+          <w:bottom w:val="none" w:color="000000" w:sz="4" w:space="0"/>
+          <w:right w:val="none" w:color="000000" w:sz="4" w:space="0"/>
+        </w:tcBorders>
+      </w:tcPr>
+    </w:tblStylePr>
+    <w:tblStylePr w:type="lastRow">
+      <w:rPr>
+        <w:b/>
+        <w:color w:val="404040"/>
+      </w:rPr>
+      <w:pPr>
+        <w:pBdr/>
+        <w:spacing/>
+        <w:ind/>
+      </w:pPr>
+      <w:tblPr>
+        <w:tblBorders/>
+      </w:tblPr>
+      <w:tcPr>
+        <w:shd w:val="clear" w:color="ffffff"/>
+        <w:tcBorders>
+          <w:top w:val="none" w:color="000000" w:sz="4" w:space="0"/>
+          <w:left w:val="none" w:color="000000" w:sz="4" w:space="0"/>
+          <w:bottom w:val="none" w:color="000000" w:sz="4" w:space="0"/>
+          <w:right w:val="none" w:color="000000" w:sz="4" w:space="0"/>
+        </w:tcBorders>
+      </w:tcPr>
+    </w:tblStylePr>
     <w:tblStylePr w:type="nwCell">
       <w:pPr>
         <w:pBdr/>
@@ -7809,9 +7926,9 @@
       </w:tcPr>
     </w:tblStylePr>
   </w:style>
-  <w:style w:type="table" w:styleId="39">
+  <w:style w:type="table" w:styleId="728">
     <w:name w:val="Grid Table 3 - Accent 6"/>
-    <w:basedOn w:val="666"/>
+    <w:basedOn w:val="889"/>
     <w:uiPriority w:val="99"/>
     <w:pPr>
       <w:pBdr/>
@@ -7910,29 +8027,6 @@
         <w:tblBorders/>
       </w:tblPr>
       <w:tcPr>
-        <w:shd w:color="ffffff"/>
-        <w:tcBorders>
-          <w:top w:val="none" w:color="000000" w:sz="4" w:space="0"/>
-          <w:left w:val="none" w:color="000000" w:sz="4" w:space="0"/>
-          <w:bottom w:val="none" w:color="000000" w:sz="4" w:space="0"/>
-          <w:right w:val="none" w:color="000000" w:sz="4" w:space="0"/>
-        </w:tcBorders>
-      </w:tcPr>
-    </w:tblStylePr>
-    <w:tblStylePr w:type="firstRow">
-      <w:rPr>
-        <w:b/>
-        <w:color w:val="404040"/>
-      </w:rPr>
-      <w:pPr>
-        <w:pBdr/>
-        <w:spacing/>
-        <w:ind/>
-      </w:pPr>
-      <w:tblPr>
-        <w:tblBorders/>
-      </w:tblPr>
-      <w:tcPr>
         <w:shd w:val="clear" w:color="ffffff"/>
         <w:tcBorders>
           <w:top w:val="none" w:color="000000" w:sz="4" w:space="0"/>
@@ -7942,30 +8036,7 @@
         </w:tcBorders>
       </w:tcPr>
     </w:tblStylePr>
-    <w:tblStylePr w:type="lastCol">
-      <w:rPr>
-        <w:i/>
-        <w:color w:val="404040"/>
-      </w:rPr>
-      <w:pPr>
-        <w:pBdr/>
-        <w:spacing/>
-        <w:ind/>
-      </w:pPr>
-      <w:tblPr>
-        <w:tblBorders/>
-      </w:tblPr>
-      <w:tcPr>
-        <w:shd w:color="ffffff"/>
-        <w:tcBorders>
-          <w:top w:val="none" w:color="000000" w:sz="4" w:space="0"/>
-          <w:left w:val="none" w:color="000000" w:sz="4" w:space="0"/>
-          <w:bottom w:val="none" w:color="000000" w:sz="4" w:space="0"/>
-          <w:right w:val="none" w:color="000000" w:sz="4" w:space="0"/>
-        </w:tcBorders>
-      </w:tcPr>
-    </w:tblStylePr>
-    <w:tblStylePr w:type="lastRow">
+    <w:tblStylePr w:type="firstRow">
       <w:rPr>
         <w:b/>
         <w:color w:val="404040"/>
@@ -7988,6 +8059,52 @@
         </w:tcBorders>
       </w:tcPr>
     </w:tblStylePr>
+    <w:tblStylePr w:type="lastCol">
+      <w:rPr>
+        <w:i/>
+        <w:color w:val="404040"/>
+      </w:rPr>
+      <w:pPr>
+        <w:pBdr/>
+        <w:spacing/>
+        <w:ind/>
+      </w:pPr>
+      <w:tblPr>
+        <w:tblBorders/>
+      </w:tblPr>
+      <w:tcPr>
+        <w:shd w:val="clear" w:color="ffffff"/>
+        <w:tcBorders>
+          <w:top w:val="none" w:color="000000" w:sz="4" w:space="0"/>
+          <w:left w:val="none" w:color="000000" w:sz="4" w:space="0"/>
+          <w:bottom w:val="none" w:color="000000" w:sz="4" w:space="0"/>
+          <w:right w:val="none" w:color="000000" w:sz="4" w:space="0"/>
+        </w:tcBorders>
+      </w:tcPr>
+    </w:tblStylePr>
+    <w:tblStylePr w:type="lastRow">
+      <w:rPr>
+        <w:b/>
+        <w:color w:val="404040"/>
+      </w:rPr>
+      <w:pPr>
+        <w:pBdr/>
+        <w:spacing/>
+        <w:ind/>
+      </w:pPr>
+      <w:tblPr>
+        <w:tblBorders/>
+      </w:tblPr>
+      <w:tcPr>
+        <w:shd w:val="clear" w:color="ffffff"/>
+        <w:tcBorders>
+          <w:top w:val="none" w:color="000000" w:sz="4" w:space="0"/>
+          <w:left w:val="none" w:color="000000" w:sz="4" w:space="0"/>
+          <w:bottom w:val="none" w:color="000000" w:sz="4" w:space="0"/>
+          <w:right w:val="none" w:color="000000" w:sz="4" w:space="0"/>
+        </w:tcBorders>
+      </w:tcPr>
+    </w:tblStylePr>
     <w:tblStylePr w:type="nwCell">
       <w:pPr>
         <w:pBdr/>
@@ -8054,9 +8171,9 @@
       </w:tcPr>
     </w:tblStylePr>
   </w:style>
-  <w:style w:type="table" w:styleId="40">
+  <w:style w:type="table" w:styleId="729">
     <w:name w:val="Grid Table 4"/>
-    <w:basedOn w:val="666"/>
+    <w:basedOn w:val="889"/>
     <w:uiPriority w:val="59"/>
     <w:pPr>
       <w:pBdr/>
@@ -8287,9 +8404,9 @@
       </w:tcPr>
     </w:tblStylePr>
   </w:style>
-  <w:style w:type="table" w:styleId="41">
+  <w:style w:type="table" w:styleId="730">
     <w:name w:val="Grid Table 4 - Accent 1"/>
-    <w:basedOn w:val="666"/>
+    <w:basedOn w:val="889"/>
     <w:uiPriority w:val="59"/>
     <w:pPr>
       <w:pBdr/>
@@ -8520,9 +8637,9 @@
       </w:tcPr>
     </w:tblStylePr>
   </w:style>
-  <w:style w:type="table" w:styleId="42">
+  <w:style w:type="table" w:styleId="731">
     <w:name w:val="Grid Table 4 - Accent 2"/>
-    <w:basedOn w:val="666"/>
+    <w:basedOn w:val="889"/>
     <w:uiPriority w:val="59"/>
     <w:pPr>
       <w:pBdr/>
@@ -8753,9 +8870,9 @@
       </w:tcPr>
     </w:tblStylePr>
   </w:style>
-  <w:style w:type="table" w:styleId="43">
+  <w:style w:type="table" w:styleId="732">
     <w:name w:val="Grid Table 4 - Accent 3"/>
-    <w:basedOn w:val="666"/>
+    <w:basedOn w:val="889"/>
     <w:uiPriority w:val="59"/>
     <w:pPr>
       <w:pBdr/>
@@ -8986,9 +9103,9 @@
       </w:tcPr>
     </w:tblStylePr>
   </w:style>
-  <w:style w:type="table" w:styleId="44">
+  <w:style w:type="table" w:styleId="733">
     <w:name w:val="Grid Table 4 - Accent 4"/>
-    <w:basedOn w:val="666"/>
+    <w:basedOn w:val="889"/>
     <w:uiPriority w:val="59"/>
     <w:pPr>
       <w:pBdr/>
@@ -9219,9 +9336,9 @@
       </w:tcPr>
     </w:tblStylePr>
   </w:style>
-  <w:style w:type="table" w:styleId="45">
+  <w:style w:type="table" w:styleId="734">
     <w:name w:val="Grid Table 4 - Accent 5"/>
-    <w:basedOn w:val="666"/>
+    <w:basedOn w:val="889"/>
     <w:uiPriority w:val="59"/>
     <w:pPr>
       <w:pBdr/>
@@ -9452,9 +9569,9 @@
       </w:tcPr>
     </w:tblStylePr>
   </w:style>
-  <w:style w:type="table" w:styleId="46">
+  <w:style w:type="table" w:styleId="735">
     <w:name w:val="Grid Table 4 - Accent 6"/>
-    <w:basedOn w:val="666"/>
+    <w:basedOn w:val="889"/>
     <w:uiPriority w:val="59"/>
     <w:pPr>
       <w:pBdr/>
@@ -9685,9 +9802,9 @@
       </w:tcPr>
     </w:tblStylePr>
   </w:style>
-  <w:style w:type="table" w:styleId="47">
+  <w:style w:type="table" w:styleId="736">
     <w:name w:val="Grid Table 5 Dark"/>
-    <w:basedOn w:val="666"/>
+    <w:basedOn w:val="889"/>
     <w:uiPriority w:val="99"/>
     <w:pPr>
       <w:pBdr/>
@@ -9913,9 +10030,9 @@
       </w:tcPr>
     </w:tblStylePr>
   </w:style>
-  <w:style w:type="table" w:styleId="48">
+  <w:style w:type="table" w:styleId="737">
     <w:name w:val="Grid Table 5 Dark- Accent 1"/>
-    <w:basedOn w:val="666"/>
+    <w:basedOn w:val="889"/>
     <w:uiPriority w:val="99"/>
     <w:pPr>
       <w:pBdr/>
@@ -10141,9 +10258,9 @@
       </w:tcPr>
     </w:tblStylePr>
   </w:style>
-  <w:style w:type="table" w:styleId="49">
+  <w:style w:type="table" w:styleId="738">
     <w:name w:val="Grid Table 5 Dark - Accent 2"/>
-    <w:basedOn w:val="666"/>
+    <w:basedOn w:val="889"/>
     <w:uiPriority w:val="99"/>
     <w:pPr>
       <w:pBdr/>
@@ -10369,9 +10486,9 @@
       </w:tcPr>
     </w:tblStylePr>
   </w:style>
-  <w:style w:type="table" w:styleId="50">
+  <w:style w:type="table" w:styleId="739">
     <w:name w:val="Grid Table 5 Dark - Accent 3"/>
-    <w:basedOn w:val="666"/>
+    <w:basedOn w:val="889"/>
     <w:uiPriority w:val="99"/>
     <w:pPr>
       <w:pBdr/>
@@ -10597,9 +10714,9 @@
       </w:tcPr>
     </w:tblStylePr>
   </w:style>
-  <w:style w:type="table" w:styleId="51">
+  <w:style w:type="table" w:styleId="740">
     <w:name w:val="Grid Table 5 Dark- Accent 4"/>
-    <w:basedOn w:val="666"/>
+    <w:basedOn w:val="889"/>
     <w:uiPriority w:val="99"/>
     <w:pPr>
       <w:pBdr/>
@@ -10825,9 +10942,9 @@
       </w:tcPr>
     </w:tblStylePr>
   </w:style>
-  <w:style w:type="table" w:styleId="52">
+  <w:style w:type="table" w:styleId="741">
     <w:name w:val="Grid Table 5 Dark - Accent 5"/>
-    <w:basedOn w:val="666"/>
+    <w:basedOn w:val="889"/>
     <w:uiPriority w:val="99"/>
     <w:pPr>
       <w:pBdr/>
@@ -11053,9 +11170,9 @@
       </w:tcPr>
     </w:tblStylePr>
   </w:style>
-  <w:style w:type="table" w:styleId="53">
+  <w:style w:type="table" w:styleId="742">
     <w:name w:val="Grid Table 5 Dark - Accent 6"/>
-    <w:basedOn w:val="666"/>
+    <w:basedOn w:val="889"/>
     <w:uiPriority w:val="99"/>
     <w:pPr>
       <w:pBdr/>
@@ -11281,9 +11398,9 @@
       </w:tcPr>
     </w:tblStylePr>
   </w:style>
-  <w:style w:type="table" w:styleId="54">
+  <w:style w:type="table" w:styleId="743">
     <w:name w:val="Grid Table 6 Colorful"/>
-    <w:basedOn w:val="666"/>
+    <w:basedOn w:val="889"/>
     <w:uiPriority w:val="99"/>
     <w:pPr>
       <w:pBdr/>
@@ -11511,9 +11628,9 @@
       </w:tcPr>
     </w:tblStylePr>
   </w:style>
-  <w:style w:type="table" w:styleId="55">
+  <w:style w:type="table" w:styleId="744">
     <w:name w:val="Grid Table 6 Colorful - Accent 1"/>
-    <w:basedOn w:val="666"/>
+    <w:basedOn w:val="889"/>
     <w:uiPriority w:val="99"/>
     <w:pPr>
       <w:pBdr/>
@@ -11741,9 +11858,9 @@
       </w:tcPr>
     </w:tblStylePr>
   </w:style>
-  <w:style w:type="table" w:styleId="56">
+  <w:style w:type="table" w:styleId="745">
     <w:name w:val="Grid Table 6 Colorful - Accent 2"/>
-    <w:basedOn w:val="666"/>
+    <w:basedOn w:val="889"/>
     <w:uiPriority w:val="99"/>
     <w:pPr>
       <w:pBdr/>
@@ -11971,9 +12088,9 @@
       </w:tcPr>
     </w:tblStylePr>
   </w:style>
-  <w:style w:type="table" w:styleId="57">
+  <w:style w:type="table" w:styleId="746">
     <w:name w:val="Grid Table 6 Colorful - Accent 3"/>
-    <w:basedOn w:val="666"/>
+    <w:basedOn w:val="889"/>
     <w:uiPriority w:val="99"/>
     <w:pPr>
       <w:pBdr/>
@@ -12201,9 +12318,9 @@
       </w:tcPr>
     </w:tblStylePr>
   </w:style>
-  <w:style w:type="table" w:styleId="58">
+  <w:style w:type="table" w:styleId="747">
     <w:name w:val="Grid Table 6 Colorful - Accent 4"/>
-    <w:basedOn w:val="666"/>
+    <w:basedOn w:val="889"/>
     <w:uiPriority w:val="99"/>
     <w:pPr>
       <w:pBdr/>
@@ -12431,9 +12548,9 @@
       </w:tcPr>
     </w:tblStylePr>
   </w:style>
-  <w:style w:type="table" w:styleId="59">
+  <w:style w:type="table" w:styleId="748">
     <w:name w:val="Grid Table 6 Colorful - Accent 5"/>
-    <w:basedOn w:val="666"/>
+    <w:basedOn w:val="889"/>
     <w:uiPriority w:val="99"/>
     <w:pPr>
       <w:pBdr/>
@@ -12661,9 +12778,9 @@
       </w:tcPr>
     </w:tblStylePr>
   </w:style>
-  <w:style w:type="table" w:styleId="60">
+  <w:style w:type="table" w:styleId="749">
     <w:name w:val="Grid Table 6 Colorful - Accent 6"/>
-    <w:basedOn w:val="666"/>
+    <w:basedOn w:val="889"/>
     <w:uiPriority w:val="99"/>
     <w:pPr>
       <w:pBdr/>
@@ -12891,9 +13008,9 @@
       </w:tcPr>
     </w:tblStylePr>
   </w:style>
-  <w:style w:type="table" w:styleId="61">
+  <w:style w:type="table" w:styleId="750">
     <w:name w:val="Grid Table 7 Colorful"/>
-    <w:basedOn w:val="666"/>
+    <w:basedOn w:val="889"/>
     <w:uiPriority w:val="99"/>
     <w:pPr>
       <w:pBdr/>
@@ -12995,11 +13112,11 @@
         <w:tblBorders/>
       </w:tblPr>
       <w:tcPr>
-        <w:shd w:color="ffffff"/>
+        <w:shd w:val="clear" w:color="ffffff"/>
         <w:tcBorders>
-          <w:top w:val="none"/>
-          <w:left w:val="none"/>
-          <w:bottom w:val="none"/>
+          <w:top w:val="none" w:color="000000" w:sz="4" w:space="0"/>
+          <w:left w:val="none" w:color="000000" w:sz="4" w:space="0"/>
+          <w:bottom w:val="none" w:color="000000" w:sz="4" w:space="0"/>
           <w:right w:val="single" w:color="000000" w:themeColor="text1" w:themeTint="80" w:sz="4" w:space="0"/>
         </w:tcBorders>
       </w:tcPr>
@@ -13022,10 +13139,10 @@
       <w:tcPr>
         <w:shd w:val="clear" w:color="ffffff" w:themeColor="light1" w:fill="ffffff" w:themeFill="light1"/>
         <w:tcBorders>
-          <w:top w:val="none"/>
-          <w:left w:val="none"/>
+          <w:top w:val="none" w:color="000000" w:sz="4" w:space="0"/>
+          <w:left w:val="none" w:color="000000" w:sz="4" w:space="0"/>
           <w:bottom w:val="single" w:color="000000" w:themeColor="text1" w:themeTint="80" w:sz="4" w:space="0"/>
-          <w:right w:val="none"/>
+          <w:right w:val="none" w:color="000000" w:sz="4" w:space="0"/>
         </w:tcBorders>
       </w:tcPr>
     </w:tblStylePr>
@@ -13045,12 +13162,12 @@
         <w:tblBorders/>
       </w:tblPr>
       <w:tcPr>
-        <w:shd w:color="ffffff"/>
+        <w:shd w:val="clear" w:color="ffffff"/>
         <w:tcBorders>
-          <w:top w:val="none"/>
+          <w:top w:val="none" w:color="000000" w:sz="4" w:space="0"/>
           <w:left w:val="single" w:color="000000" w:themeColor="text1" w:themeTint="80" w:sz="4" w:space="0"/>
-          <w:bottom w:val="none"/>
-          <w:right w:val="none"/>
+          <w:bottom w:val="none" w:color="000000" w:sz="4" w:space="0"/>
+          <w:right w:val="none" w:color="000000" w:sz="4" w:space="0"/>
         </w:tcBorders>
       </w:tcPr>
     </w:tblStylePr>
@@ -13073,9 +13190,9 @@
         <w:shd w:val="clear" w:color="ffffff" w:themeColor="light1" w:fill="ffffff" w:themeFill="light1"/>
         <w:tcBorders>
           <w:top w:val="single" w:color="000000" w:themeColor="text1" w:themeTint="80" w:sz="4" w:space="0"/>
-          <w:left w:val="none"/>
-          <w:bottom w:val="none"/>
-          <w:right w:val="none"/>
+          <w:left w:val="none" w:color="000000" w:sz="4" w:space="0"/>
+          <w:bottom w:val="none" w:color="000000" w:sz="4" w:space="0"/>
+          <w:right w:val="none" w:color="000000" w:sz="4" w:space="0"/>
         </w:tcBorders>
       </w:tcPr>
     </w:tblStylePr>
@@ -13145,9 +13262,9 @@
       </w:tcPr>
     </w:tblStylePr>
   </w:style>
-  <w:style w:type="table" w:styleId="62">
+  <w:style w:type="table" w:styleId="751">
     <w:name w:val="Grid Table 7 Colorful - Accent 1"/>
-    <w:basedOn w:val="666"/>
+    <w:basedOn w:val="889"/>
     <w:uiPriority w:val="99"/>
     <w:pPr>
       <w:pBdr/>
@@ -13249,11 +13366,11 @@
         <w:tblBorders/>
       </w:tblPr>
       <w:tcPr>
-        <w:shd w:color="ffffff"/>
+        <w:shd w:val="clear" w:color="ffffff"/>
         <w:tcBorders>
-          <w:top w:val="none"/>
-          <w:left w:val="none"/>
-          <w:bottom w:val="none"/>
+          <w:top w:val="none" w:color="000000" w:sz="4" w:space="0"/>
+          <w:left w:val="none" w:color="000000" w:sz="4" w:space="0"/>
+          <w:bottom w:val="none" w:color="000000" w:sz="4" w:space="0"/>
           <w:right w:val="single" w:color="000000" w:themeColor="accent1" w:themeTint="80" w:sz="4" w:space="0"/>
         </w:tcBorders>
       </w:tcPr>
@@ -13276,10 +13393,10 @@
       <w:tcPr>
         <w:shd w:val="clear" w:color="ffffff" w:themeColor="light1" w:fill="ffffff" w:themeFill="light1"/>
         <w:tcBorders>
-          <w:top w:val="none"/>
-          <w:left w:val="none"/>
+          <w:top w:val="none" w:color="000000" w:sz="4" w:space="0"/>
+          <w:left w:val="none" w:color="000000" w:sz="4" w:space="0"/>
           <w:bottom w:val="single" w:color="000000" w:themeColor="accent1" w:themeTint="80" w:sz="4" w:space="0"/>
-          <w:right w:val="none"/>
+          <w:right w:val="none" w:color="000000" w:sz="4" w:space="0"/>
         </w:tcBorders>
       </w:tcPr>
     </w:tblStylePr>
@@ -13299,12 +13416,12 @@
         <w:tblBorders/>
       </w:tblPr>
       <w:tcPr>
-        <w:shd w:color="ffffff"/>
+        <w:shd w:val="clear" w:color="ffffff"/>
         <w:tcBorders>
-          <w:top w:val="none"/>
+          <w:top w:val="none" w:color="000000" w:sz="4" w:space="0"/>
           <w:left w:val="single" w:color="000000" w:themeColor="accent1" w:themeTint="80" w:sz="4" w:space="0"/>
-          <w:bottom w:val="none"/>
-          <w:right w:val="none"/>
+          <w:bottom w:val="none" w:color="000000" w:sz="4" w:space="0"/>
+          <w:right w:val="none" w:color="000000" w:sz="4" w:space="0"/>
         </w:tcBorders>
       </w:tcPr>
     </w:tblStylePr>
@@ -13327,9 +13444,9 @@
         <w:shd w:val="clear" w:color="ffffff" w:themeColor="light1" w:fill="ffffff" w:themeFill="light1"/>
         <w:tcBorders>
           <w:top w:val="single" w:color="000000" w:themeColor="accent1" w:themeTint="80" w:sz="4" w:space="0"/>
-          <w:left w:val="none"/>
-          <w:bottom w:val="none"/>
-          <w:right w:val="none"/>
+          <w:left w:val="none" w:color="000000" w:sz="4" w:space="0"/>
+          <w:bottom w:val="none" w:color="000000" w:sz="4" w:space="0"/>
+          <w:right w:val="none" w:color="000000" w:sz="4" w:space="0"/>
         </w:tcBorders>
       </w:tcPr>
     </w:tblStylePr>
@@ -13399,9 +13516,9 @@
       </w:tcPr>
     </w:tblStylePr>
   </w:style>
-  <w:style w:type="table" w:styleId="63">
+  <w:style w:type="table" w:styleId="752">
     <w:name w:val="Grid Table 7 Colorful - Accent 2"/>
-    <w:basedOn w:val="666"/>
+    <w:basedOn w:val="889"/>
     <w:uiPriority w:val="99"/>
     <w:pPr>
       <w:pBdr/>
@@ -13503,11 +13620,11 @@
         <w:tblBorders/>
       </w:tblPr>
       <w:tcPr>
-        <w:shd w:color="ffffff"/>
+        <w:shd w:val="clear" w:color="ffffff"/>
         <w:tcBorders>
-          <w:top w:val="none"/>
-          <w:left w:val="none"/>
-          <w:bottom w:val="none"/>
+          <w:top w:val="none" w:color="000000" w:sz="4" w:space="0"/>
+          <w:left w:val="none" w:color="000000" w:sz="4" w:space="0"/>
+          <w:bottom w:val="none" w:color="000000" w:sz="4" w:space="0"/>
           <w:right w:val="single" w:color="000000" w:themeColor="accent2" w:themeTint="97" w:sz="4" w:space="0"/>
         </w:tcBorders>
       </w:tcPr>
@@ -13530,10 +13647,10 @@
       <w:tcPr>
         <w:shd w:val="clear" w:color="ffffff" w:themeColor="light1" w:fill="ffffff" w:themeFill="light1"/>
         <w:tcBorders>
-          <w:top w:val="none"/>
-          <w:left w:val="none"/>
+          <w:top w:val="none" w:color="000000" w:sz="4" w:space="0"/>
+          <w:left w:val="none" w:color="000000" w:sz="4" w:space="0"/>
           <w:bottom w:val="single" w:color="000000" w:themeColor="accent2" w:themeTint="97" w:sz="4" w:space="0"/>
-          <w:right w:val="none"/>
+          <w:right w:val="none" w:color="000000" w:sz="4" w:space="0"/>
         </w:tcBorders>
       </w:tcPr>
     </w:tblStylePr>
@@ -13553,12 +13670,12 @@
         <w:tblBorders/>
       </w:tblPr>
       <w:tcPr>
-        <w:shd w:color="ffffff"/>
+        <w:shd w:val="clear" w:color="ffffff"/>
         <w:tcBorders>
-          <w:top w:val="none"/>
+          <w:top w:val="none" w:color="000000" w:sz="4" w:space="0"/>
           <w:left w:val="single" w:color="000000" w:themeColor="accent2" w:themeTint="97" w:sz="4" w:space="0"/>
-          <w:bottom w:val="none"/>
-          <w:right w:val="none"/>
+          <w:bottom w:val="none" w:color="000000" w:sz="4" w:space="0"/>
+          <w:right w:val="none" w:color="000000" w:sz="4" w:space="0"/>
         </w:tcBorders>
       </w:tcPr>
     </w:tblStylePr>
@@ -13581,9 +13698,9 @@
         <w:shd w:val="clear" w:color="ffffff" w:themeColor="light1" w:fill="ffffff" w:themeFill="light1"/>
         <w:tcBorders>
           <w:top w:val="single" w:color="000000" w:themeColor="accent2" w:themeTint="97" w:sz="4" w:space="0"/>
-          <w:left w:val="none"/>
-          <w:bottom w:val="none"/>
-          <w:right w:val="none"/>
+          <w:left w:val="none" w:color="000000" w:sz="4" w:space="0"/>
+          <w:bottom w:val="none" w:color="000000" w:sz="4" w:space="0"/>
+          <w:right w:val="none" w:color="000000" w:sz="4" w:space="0"/>
         </w:tcBorders>
       </w:tcPr>
     </w:tblStylePr>
@@ -13653,9 +13770,9 @@
       </w:tcPr>
     </w:tblStylePr>
   </w:style>
-  <w:style w:type="table" w:styleId="64">
+  <w:style w:type="table" w:styleId="753">
     <w:name w:val="Grid Table 7 Colorful - Accent 3"/>
-    <w:basedOn w:val="666"/>
+    <w:basedOn w:val="889"/>
     <w:uiPriority w:val="99"/>
     <w:pPr>
       <w:pBdr/>
@@ -13757,11 +13874,11 @@
         <w:tblBorders/>
       </w:tblPr>
       <w:tcPr>
-        <w:shd w:color="ffffff"/>
+        <w:shd w:val="clear" w:color="ffffff"/>
         <w:tcBorders>
-          <w:top w:val="none"/>
-          <w:left w:val="none"/>
-          <w:bottom w:val="none"/>
+          <w:top w:val="none" w:color="000000" w:sz="4" w:space="0"/>
+          <w:left w:val="none" w:color="000000" w:sz="4" w:space="0"/>
+          <w:bottom w:val="none" w:color="000000" w:sz="4" w:space="0"/>
           <w:right w:val="single" w:color="000000" w:themeColor="accent3" w:themeTint="FE" w:sz="4" w:space="0"/>
         </w:tcBorders>
       </w:tcPr>
@@ -13784,10 +13901,10 @@
       <w:tcPr>
         <w:shd w:val="clear" w:color="ffffff" w:themeColor="light1" w:fill="ffffff" w:themeFill="light1"/>
         <w:tcBorders>
-          <w:top w:val="none"/>
-          <w:left w:val="none"/>
+          <w:top w:val="none" w:color="000000" w:sz="4" w:space="0"/>
+          <w:left w:val="none" w:color="000000" w:sz="4" w:space="0"/>
           <w:bottom w:val="single" w:color="000000" w:themeColor="accent3" w:themeTint="FE" w:sz="4" w:space="0"/>
-          <w:right w:val="none"/>
+          <w:right w:val="none" w:color="000000" w:sz="4" w:space="0"/>
         </w:tcBorders>
       </w:tcPr>
     </w:tblStylePr>
@@ -13807,12 +13924,12 @@
         <w:tblBorders/>
       </w:tblPr>
       <w:tcPr>
-        <w:shd w:color="ffffff"/>
+        <w:shd w:val="clear" w:color="ffffff"/>
         <w:tcBorders>
-          <w:top w:val="none"/>
+          <w:top w:val="none" w:color="000000" w:sz="4" w:space="0"/>
           <w:left w:val="single" w:color="000000" w:themeColor="accent3" w:themeTint="FE" w:sz="4" w:space="0"/>
-          <w:bottom w:val="none"/>
-          <w:right w:val="none"/>
+          <w:bottom w:val="none" w:color="000000" w:sz="4" w:space="0"/>
+          <w:right w:val="none" w:color="000000" w:sz="4" w:space="0"/>
         </w:tcBorders>
       </w:tcPr>
     </w:tblStylePr>
@@ -13835,9 +13952,9 @@
         <w:shd w:val="clear" w:color="ffffff" w:themeColor="light1" w:fill="ffffff" w:themeFill="light1"/>
         <w:tcBorders>
           <w:top w:val="single" w:color="000000" w:themeColor="accent3" w:themeTint="FE" w:sz="4" w:space="0"/>
-          <w:left w:val="none"/>
-          <w:bottom w:val="none"/>
-          <w:right w:val="none"/>
+          <w:left w:val="none" w:color="000000" w:sz="4" w:space="0"/>
+          <w:bottom w:val="none" w:color="000000" w:sz="4" w:space="0"/>
+          <w:right w:val="none" w:color="000000" w:sz="4" w:space="0"/>
         </w:tcBorders>
       </w:tcPr>
     </w:tblStylePr>
@@ -13907,9 +14024,9 @@
       </w:tcPr>
     </w:tblStylePr>
   </w:style>
-  <w:style w:type="table" w:styleId="65">
+  <w:style w:type="table" w:styleId="754">
     <w:name w:val="Grid Table 7 Colorful - Accent 4"/>
-    <w:basedOn w:val="666"/>
+    <w:basedOn w:val="889"/>
     <w:uiPriority w:val="99"/>
     <w:pPr>
       <w:pBdr/>
@@ -14011,11 +14128,11 @@
         <w:tblBorders/>
       </w:tblPr>
       <w:tcPr>
-        <w:shd w:color="ffffff"/>
+        <w:shd w:val="clear" w:color="ffffff"/>
         <w:tcBorders>
-          <w:top w:val="none"/>
-          <w:left w:val="none"/>
-          <w:bottom w:val="none"/>
+          <w:top w:val="none" w:color="000000" w:sz="4" w:space="0"/>
+          <w:left w:val="none" w:color="000000" w:sz="4" w:space="0"/>
+          <w:bottom w:val="none" w:color="000000" w:sz="4" w:space="0"/>
           <w:right w:val="single" w:color="000000" w:themeColor="accent4" w:themeTint="9A" w:sz="4" w:space="0"/>
         </w:tcBorders>
       </w:tcPr>
@@ -14038,10 +14155,10 @@
       <w:tcPr>
         <w:shd w:val="clear" w:color="ffffff" w:themeColor="light1" w:fill="ffffff" w:themeFill="light1"/>
         <w:tcBorders>
-          <w:top w:val="none"/>
-          <w:left w:val="none"/>
+          <w:top w:val="none" w:color="000000" w:sz="4" w:space="0"/>
+          <w:left w:val="none" w:color="000000" w:sz="4" w:space="0"/>
           <w:bottom w:val="single" w:color="000000" w:themeColor="accent4" w:themeTint="9A" w:sz="4" w:space="0"/>
-          <w:right w:val="none"/>
+          <w:right w:val="none" w:color="000000" w:sz="4" w:space="0"/>
         </w:tcBorders>
       </w:tcPr>
     </w:tblStylePr>
@@ -14061,12 +14178,12 @@
         <w:tblBorders/>
       </w:tblPr>
       <w:tcPr>
-        <w:shd w:color="ffffff"/>
+        <w:shd w:val="clear" w:color="ffffff"/>
         <w:tcBorders>
-          <w:top w:val="none"/>
+          <w:top w:val="none" w:color="000000" w:sz="4" w:space="0"/>
           <w:left w:val="single" w:color="000000" w:themeColor="accent4" w:themeTint="9A" w:sz="4" w:space="0"/>
-          <w:bottom w:val="none"/>
-          <w:right w:val="none"/>
+          <w:bottom w:val="none" w:color="000000" w:sz="4" w:space="0"/>
+          <w:right w:val="none" w:color="000000" w:sz="4" w:space="0"/>
         </w:tcBorders>
       </w:tcPr>
     </w:tblStylePr>
@@ -14089,9 +14206,9 @@
         <w:shd w:val="clear" w:color="ffffff" w:themeColor="light1" w:fill="ffffff" w:themeFill="light1"/>
         <w:tcBorders>
           <w:top w:val="single" w:color="000000" w:themeColor="accent4" w:themeTint="9A" w:sz="4" w:space="0"/>
-          <w:left w:val="none"/>
-          <w:bottom w:val="none"/>
-          <w:right w:val="none"/>
+          <w:left w:val="none" w:color="000000" w:sz="4" w:space="0"/>
+          <w:bottom w:val="none" w:color="000000" w:sz="4" w:space="0"/>
+          <w:right w:val="none" w:color="000000" w:sz="4" w:space="0"/>
         </w:tcBorders>
       </w:tcPr>
     </w:tblStylePr>
@@ -14161,9 +14278,9 @@
       </w:tcPr>
     </w:tblStylePr>
   </w:style>
-  <w:style w:type="table" w:styleId="66">
+  <w:style w:type="table" w:styleId="755">
     <w:name w:val="Grid Table 7 Colorful - Accent 5"/>
-    <w:basedOn w:val="666"/>
+    <w:basedOn w:val="889"/>
     <w:uiPriority w:val="99"/>
     <w:pPr>
       <w:pBdr/>
@@ -14265,11 +14382,11 @@
         <w:tblBorders/>
       </w:tblPr>
       <w:tcPr>
-        <w:shd w:color="ffffff"/>
+        <w:shd w:val="clear" w:color="ffffff"/>
         <w:tcBorders>
-          <w:top w:val="none"/>
-          <w:left w:val="none"/>
-          <w:bottom w:val="none"/>
+          <w:top w:val="none" w:color="000000" w:sz="4" w:space="0"/>
+          <w:left w:val="none" w:color="000000" w:sz="4" w:space="0"/>
+          <w:bottom w:val="none" w:color="000000" w:sz="4" w:space="0"/>
           <w:right w:val="single" w:color="000000" w:themeColor="accent5" w:themeTint="90" w:sz="4" w:space="0"/>
         </w:tcBorders>
       </w:tcPr>
@@ -14292,10 +14409,10 @@
       <w:tcPr>
         <w:shd w:val="clear" w:color="ffffff" w:themeColor="light1" w:fill="ffffff" w:themeFill="light1"/>
         <w:tcBorders>
-          <w:top w:val="none"/>
-          <w:left w:val="none"/>
+          <w:top w:val="none" w:color="000000" w:sz="4" w:space="0"/>
+          <w:left w:val="none" w:color="000000" w:sz="4" w:space="0"/>
           <w:bottom w:val="single" w:color="000000" w:themeColor="accent5" w:themeTint="90" w:sz="4" w:space="0"/>
-          <w:right w:val="none"/>
+          <w:right w:val="none" w:color="000000" w:sz="4" w:space="0"/>
         </w:tcBorders>
       </w:tcPr>
     </w:tblStylePr>
@@ -14315,12 +14432,12 @@
         <w:tblBorders/>
       </w:tblPr>
       <w:tcPr>
-        <w:shd w:color="ffffff"/>
+        <w:shd w:val="clear" w:color="ffffff"/>
         <w:tcBorders>
-          <w:top w:val="none"/>
+          <w:top w:val="none" w:color="000000" w:sz="4" w:space="0"/>
           <w:left w:val="single" w:color="000000" w:themeColor="accent5" w:themeTint="90" w:sz="4" w:space="0"/>
-          <w:bottom w:val="none"/>
-          <w:right w:val="none"/>
+          <w:bottom w:val="none" w:color="000000" w:sz="4" w:space="0"/>
+          <w:right w:val="none" w:color="000000" w:sz="4" w:space="0"/>
         </w:tcBorders>
       </w:tcPr>
     </w:tblStylePr>
@@ -14343,9 +14460,9 @@
         <w:shd w:val="clear" w:color="ffffff" w:themeColor="light1" w:fill="ffffff" w:themeFill="light1"/>
         <w:tcBorders>
           <w:top w:val="single" w:color="000000" w:themeColor="accent5" w:themeTint="90" w:sz="4" w:space="0"/>
-          <w:left w:val="none"/>
-          <w:bottom w:val="none"/>
-          <w:right w:val="none"/>
+          <w:left w:val="none" w:color="000000" w:sz="4" w:space="0"/>
+          <w:bottom w:val="none" w:color="000000" w:sz="4" w:space="0"/>
+          <w:right w:val="none" w:color="000000" w:sz="4" w:space="0"/>
         </w:tcBorders>
       </w:tcPr>
     </w:tblStylePr>
@@ -14415,9 +14532,9 @@
       </w:tcPr>
     </w:tblStylePr>
   </w:style>
-  <w:style w:type="table" w:styleId="67">
+  <w:style w:type="table" w:styleId="756">
     <w:name w:val="Grid Table 7 Colorful - Accent 6"/>
-    <w:basedOn w:val="666"/>
+    <w:basedOn w:val="889"/>
     <w:uiPriority w:val="99"/>
     <w:pPr>
       <w:pBdr/>
@@ -14519,11 +14636,11 @@
         <w:tblBorders/>
       </w:tblPr>
       <w:tcPr>
-        <w:shd w:color="ffffff"/>
+        <w:shd w:val="clear" w:color="ffffff"/>
         <w:tcBorders>
-          <w:top w:val="none"/>
-          <w:left w:val="none"/>
-          <w:bottom w:val="none"/>
+          <w:top w:val="none" w:color="000000" w:sz="4" w:space="0"/>
+          <w:left w:val="none" w:color="000000" w:sz="4" w:space="0"/>
+          <w:bottom w:val="none" w:color="000000" w:sz="4" w:space="0"/>
           <w:right w:val="single" w:color="000000" w:themeColor="accent6" w:themeTint="90" w:sz="4" w:space="0"/>
         </w:tcBorders>
       </w:tcPr>
@@ -14546,10 +14663,10 @@
       <w:tcPr>
         <w:shd w:val="clear" w:color="ffffff" w:themeColor="light1" w:fill="ffffff" w:themeFill="light1"/>
         <w:tcBorders>
-          <w:top w:val="none"/>
-          <w:left w:val="none"/>
+          <w:top w:val="none" w:color="000000" w:sz="4" w:space="0"/>
+          <w:left w:val="none" w:color="000000" w:sz="4" w:space="0"/>
           <w:bottom w:val="single" w:color="000000" w:themeColor="accent6" w:themeTint="90" w:sz="4" w:space="0"/>
-          <w:right w:val="none"/>
+          <w:right w:val="none" w:color="000000" w:sz="4" w:space="0"/>
         </w:tcBorders>
       </w:tcPr>
     </w:tblStylePr>
@@ -14569,12 +14686,12 @@
         <w:tblBorders/>
       </w:tblPr>
       <w:tcPr>
-        <w:shd w:color="ffffff"/>
+        <w:shd w:val="clear" w:color="ffffff"/>
         <w:tcBorders>
-          <w:top w:val="none"/>
+          <w:top w:val="none" w:color="000000" w:sz="4" w:space="0"/>
           <w:left w:val="single" w:color="000000" w:themeColor="accent6" w:themeTint="90" w:sz="4" w:space="0"/>
-          <w:bottom w:val="none"/>
-          <w:right w:val="none"/>
+          <w:bottom w:val="none" w:color="000000" w:sz="4" w:space="0"/>
+          <w:right w:val="none" w:color="000000" w:sz="4" w:space="0"/>
         </w:tcBorders>
       </w:tcPr>
     </w:tblStylePr>
@@ -14597,9 +14714,9 @@
         <w:shd w:val="clear" w:color="ffffff" w:themeColor="light1" w:fill="ffffff" w:themeFill="light1"/>
         <w:tcBorders>
           <w:top w:val="single" w:color="000000" w:themeColor="accent6" w:themeTint="90" w:sz="4" w:space="0"/>
-          <w:left w:val="none"/>
-          <w:bottom w:val="none"/>
-          <w:right w:val="none"/>
+          <w:left w:val="none" w:color="000000" w:sz="4" w:space="0"/>
+          <w:bottom w:val="none" w:color="000000" w:sz="4" w:space="0"/>
+          <w:right w:val="none" w:color="000000" w:sz="4" w:space="0"/>
         </w:tcBorders>
       </w:tcPr>
     </w:tblStylePr>
@@ -14669,9 +14786,9 @@
       </w:tcPr>
     </w:tblStylePr>
   </w:style>
-  <w:style w:type="table" w:styleId="68">
+  <w:style w:type="table" w:styleId="757">
     <w:name w:val="List Table 1 Light"/>
-    <w:basedOn w:val="666"/>
+    <w:basedOn w:val="889"/>
     <w:uiPriority w:val="99"/>
     <w:pPr>
       <w:pBdr/>
@@ -14885,9 +15002,9 @@
       </w:tcPr>
     </w:tblStylePr>
   </w:style>
-  <w:style w:type="table" w:styleId="69">
+  <w:style w:type="table" w:styleId="758">
     <w:name w:val="List Table 1 Light - Accent 1"/>
-    <w:basedOn w:val="666"/>
+    <w:basedOn w:val="889"/>
     <w:uiPriority w:val="99"/>
     <w:pPr>
       <w:pBdr/>
@@ -15101,9 +15218,9 @@
       </w:tcPr>
     </w:tblStylePr>
   </w:style>
-  <w:style w:type="table" w:styleId="70">
+  <w:style w:type="table" w:styleId="759">
     <w:name w:val="List Table 1 Light - Accent 2"/>
-    <w:basedOn w:val="666"/>
+    <w:basedOn w:val="889"/>
     <w:uiPriority w:val="99"/>
     <w:pPr>
       <w:pBdr/>
@@ -15317,9 +15434,9 @@
       </w:tcPr>
     </w:tblStylePr>
   </w:style>
-  <w:style w:type="table" w:styleId="71">
+  <w:style w:type="table" w:styleId="760">
     <w:name w:val="List Table 1 Light - Accent 3"/>
-    <w:basedOn w:val="666"/>
+    <w:basedOn w:val="889"/>
     <w:uiPriority w:val="99"/>
     <w:pPr>
       <w:pBdr/>
@@ -15533,9 +15650,9 @@
       </w:tcPr>
     </w:tblStylePr>
   </w:style>
-  <w:style w:type="table" w:styleId="72">
+  <w:style w:type="table" w:styleId="761">
     <w:name w:val="List Table 1 Light - Accent 4"/>
-    <w:basedOn w:val="666"/>
+    <w:basedOn w:val="889"/>
     <w:uiPriority w:val="99"/>
     <w:pPr>
       <w:pBdr/>
@@ -15749,9 +15866,9 @@
       </w:tcPr>
     </w:tblStylePr>
   </w:style>
-  <w:style w:type="table" w:styleId="73">
+  <w:style w:type="table" w:styleId="762">
     <w:name w:val="List Table 1 Light - Accent 5"/>
-    <w:basedOn w:val="666"/>
+    <w:basedOn w:val="889"/>
     <w:uiPriority w:val="99"/>
     <w:pPr>
       <w:pBdr/>
@@ -15965,9 +16082,9 @@
       </w:tcPr>
     </w:tblStylePr>
   </w:style>
-  <w:style w:type="table" w:styleId="74">
+  <w:style w:type="table" w:styleId="763">
     <w:name w:val="List Table 1 Light - Accent 6"/>
-    <w:basedOn w:val="666"/>
+    <w:basedOn w:val="889"/>
     <w:uiPriority w:val="99"/>
     <w:pPr>
       <w:pBdr/>
@@ -16181,9 +16298,9 @@
       </w:tcPr>
     </w:tblStylePr>
   </w:style>
-  <w:style w:type="table" w:styleId="75">
+  <w:style w:type="table" w:styleId="764">
     <w:name w:val="List Table 2"/>
-    <w:basedOn w:val="666"/>
+    <w:basedOn w:val="889"/>
     <w:uiPriority w:val="99"/>
     <w:pPr>
       <w:pBdr/>
@@ -16419,9 +16536,9 @@
       </w:tcPr>
     </w:tblStylePr>
   </w:style>
-  <w:style w:type="table" w:styleId="76">
+  <w:style w:type="table" w:styleId="765">
     <w:name w:val="List Table 2 - Accent 1"/>
-    <w:basedOn w:val="666"/>
+    <w:basedOn w:val="889"/>
     <w:uiPriority w:val="99"/>
     <w:pPr>
       <w:pBdr/>
@@ -16657,9 +16774,9 @@
       </w:tcPr>
     </w:tblStylePr>
   </w:style>
-  <w:style w:type="table" w:styleId="77">
+  <w:style w:type="table" w:styleId="766">
     <w:name w:val="List Table 2 - Accent 2"/>
-    <w:basedOn w:val="666"/>
+    <w:basedOn w:val="889"/>
     <w:uiPriority w:val="99"/>
     <w:pPr>
       <w:pBdr/>
@@ -16895,9 +17012,9 @@
       </w:tcPr>
     </w:tblStylePr>
   </w:style>
-  <w:style w:type="table" w:styleId="78">
+  <w:style w:type="table" w:styleId="767">
     <w:name w:val="List Table 2 - Accent 3"/>
-    <w:basedOn w:val="666"/>
+    <w:basedOn w:val="889"/>
     <w:uiPriority w:val="99"/>
     <w:pPr>
       <w:pBdr/>
@@ -17133,9 +17250,9 @@
       </w:tcPr>
     </w:tblStylePr>
   </w:style>
-  <w:style w:type="table" w:styleId="79">
+  <w:style w:type="table" w:styleId="768">
     <w:name w:val="List Table 2 - Accent 4"/>
-    <w:basedOn w:val="666"/>
+    <w:basedOn w:val="889"/>
     <w:uiPriority w:val="99"/>
     <w:pPr>
       <w:pBdr/>
@@ -17371,9 +17488,9 @@
       </w:tcPr>
     </w:tblStylePr>
   </w:style>
-  <w:style w:type="table" w:styleId="80">
+  <w:style w:type="table" w:styleId="769">
     <w:name w:val="List Table 2 - Accent 5"/>
-    <w:basedOn w:val="666"/>
+    <w:basedOn w:val="889"/>
     <w:uiPriority w:val="99"/>
     <w:pPr>
       <w:pBdr/>
@@ -17609,9 +17726,9 @@
       </w:tcPr>
     </w:tblStylePr>
   </w:style>
-  <w:style w:type="table" w:styleId="81">
+  <w:style w:type="table" w:styleId="770">
     <w:name w:val="List Table 2 - Accent 6"/>
-    <w:basedOn w:val="666"/>
+    <w:basedOn w:val="889"/>
     <w:uiPriority w:val="99"/>
     <w:pPr>
       <w:pBdr/>
@@ -17847,9 +17964,9 @@
       </w:tcPr>
     </w:tblStylePr>
   </w:style>
-  <w:style w:type="table" w:styleId="82">
+  <w:style w:type="table" w:styleId="771">
     <w:name w:val="List Table 3"/>
-    <w:basedOn w:val="666"/>
+    <w:basedOn w:val="889"/>
     <w:uiPriority w:val="99"/>
     <w:pPr>
       <w:pBdr/>
@@ -18075,9 +18192,9 @@
       </w:tcPr>
     </w:tblStylePr>
   </w:style>
-  <w:style w:type="table" w:styleId="83">
+  <w:style w:type="table" w:styleId="772">
     <w:name w:val="List Table 3 - Accent 1"/>
-    <w:basedOn w:val="666"/>
+    <w:basedOn w:val="889"/>
     <w:uiPriority w:val="99"/>
     <w:pPr>
       <w:pBdr/>
@@ -18303,9 +18420,9 @@
       </w:tcPr>
     </w:tblStylePr>
   </w:style>
-  <w:style w:type="table" w:styleId="84">
+  <w:style w:type="table" w:styleId="773">
     <w:name w:val="List Table 3 - Accent 2"/>
-    <w:basedOn w:val="666"/>
+    <w:basedOn w:val="889"/>
     <w:uiPriority w:val="99"/>
     <w:pPr>
       <w:pBdr/>
@@ -18531,9 +18648,9 @@
       </w:tcPr>
     </w:tblStylePr>
   </w:style>
-  <w:style w:type="table" w:styleId="85">
+  <w:style w:type="table" w:styleId="774">
     <w:name w:val="List Table 3 - Accent 3"/>
-    <w:basedOn w:val="666"/>
+    <w:basedOn w:val="889"/>
     <w:uiPriority w:val="99"/>
     <w:pPr>
       <w:pBdr/>
@@ -18759,9 +18876,9 @@
       </w:tcPr>
     </w:tblStylePr>
   </w:style>
-  <w:style w:type="table" w:styleId="86">
+  <w:style w:type="table" w:styleId="775">
     <w:name w:val="List Table 3 - Accent 4"/>
-    <w:basedOn w:val="666"/>
+    <w:basedOn w:val="889"/>
     <w:uiPriority w:val="99"/>
     <w:pPr>
       <w:pBdr/>
@@ -18987,9 +19104,9 @@
       </w:tcPr>
     </w:tblStylePr>
   </w:style>
-  <w:style w:type="table" w:styleId="87">
+  <w:style w:type="table" w:styleId="776">
     <w:name w:val="List Table 3 - Accent 5"/>
-    <w:basedOn w:val="666"/>
+    <w:basedOn w:val="889"/>
     <w:uiPriority w:val="99"/>
     <w:pPr>
       <w:pBdr/>
@@ -19215,9 +19332,9 @@
       </w:tcPr>
     </w:tblStylePr>
   </w:style>
-  <w:style w:type="table" w:styleId="88">
+  <w:style w:type="table" w:styleId="777">
     <w:name w:val="List Table 3 - Accent 6"/>
-    <w:basedOn w:val="666"/>
+    <w:basedOn w:val="889"/>
     <w:uiPriority w:val="99"/>
     <w:pPr>
       <w:pBdr/>
@@ -19443,9 +19560,9 @@
       </w:tcPr>
     </w:tblStylePr>
   </w:style>
-  <w:style w:type="table" w:styleId="89">
+  <w:style w:type="table" w:styleId="778">
     <w:name w:val="List Table 4"/>
-    <w:basedOn w:val="666"/>
+    <w:basedOn w:val="889"/>
     <w:uiPriority w:val="99"/>
     <w:pPr>
       <w:pBdr/>
@@ -19668,9 +19785,9 @@
       </w:tcPr>
     </w:tblStylePr>
   </w:style>
-  <w:style w:type="table" w:styleId="90">
+  <w:style w:type="table" w:styleId="779">
     <w:name w:val="List Table 4 - Accent 1"/>
-    <w:basedOn w:val="666"/>
+    <w:basedOn w:val="889"/>
     <w:uiPriority w:val="99"/>
     <w:pPr>
       <w:pBdr/>
@@ -19893,9 +20010,9 @@
       </w:tcPr>
     </w:tblStylePr>
   </w:style>
-  <w:style w:type="table" w:styleId="91">
+  <w:style w:type="table" w:styleId="780">
     <w:name w:val="List Table 4 - Accent 2"/>
-    <w:basedOn w:val="666"/>
+    <w:basedOn w:val="889"/>
     <w:uiPriority w:val="99"/>
     <w:pPr>
       <w:pBdr/>
@@ -20118,9 +20235,9 @@
       </w:tcPr>
     </w:tblStylePr>
   </w:style>
-  <w:style w:type="table" w:styleId="92">
+  <w:style w:type="table" w:styleId="781">
     <w:name w:val="List Table 4 - Accent 3"/>
-    <w:basedOn w:val="666"/>
+    <w:basedOn w:val="889"/>
     <w:uiPriority w:val="99"/>
     <w:pPr>
       <w:pBdr/>
@@ -20343,9 +20460,9 @@
       </w:tcPr>
     </w:tblStylePr>
   </w:style>
-  <w:style w:type="table" w:styleId="93">
+  <w:style w:type="table" w:styleId="782">
     <w:name w:val="List Table 4 - Accent 4"/>
-    <w:basedOn w:val="666"/>
+    <w:basedOn w:val="889"/>
     <w:uiPriority w:val="99"/>
     <w:pPr>
       <w:pBdr/>
@@ -20568,9 +20685,9 @@
       </w:tcPr>
     </w:tblStylePr>
   </w:style>
-  <w:style w:type="table" w:styleId="94">
+  <w:style w:type="table" w:styleId="783">
     <w:name w:val="List Table 4 - Accent 5"/>
-    <w:basedOn w:val="666"/>
+    <w:basedOn w:val="889"/>
     <w:uiPriority w:val="99"/>
     <w:pPr>
       <w:pBdr/>
@@ -20793,9 +20910,9 @@
       </w:tcPr>
     </w:tblStylePr>
   </w:style>
-  <w:style w:type="table" w:styleId="95">
+  <w:style w:type="table" w:styleId="784">
     <w:name w:val="List Table 4 - Accent 6"/>
-    <w:basedOn w:val="666"/>
+    <w:basedOn w:val="889"/>
     <w:uiPriority w:val="99"/>
     <w:pPr>
       <w:pBdr/>
@@ -21018,9 +21135,9 @@
       </w:tcPr>
     </w:tblStylePr>
   </w:style>
-  <w:style w:type="table" w:styleId="96">
+  <w:style w:type="table" w:styleId="785">
     <w:name w:val="List Table 5 Dark"/>
-    <w:basedOn w:val="666"/>
+    <w:basedOn w:val="889"/>
     <w:uiPriority w:val="99"/>
     <w:pPr>
       <w:pBdr/>
@@ -21260,9 +21377,9 @@
       </w:tcPr>
     </w:tblStylePr>
   </w:style>
-  <w:style w:type="table" w:styleId="97">
+  <w:style w:type="table" w:styleId="786">
     <w:name w:val="List Table 5 Dark - Accent 1"/>
-    <w:basedOn w:val="666"/>
+    <w:basedOn w:val="889"/>
     <w:uiPriority w:val="99"/>
     <w:pPr>
       <w:pBdr/>
@@ -21502,9 +21619,9 @@
       </w:tcPr>
     </w:tblStylePr>
   </w:style>
-  <w:style w:type="table" w:styleId="98">
+  <w:style w:type="table" w:styleId="787">
     <w:name w:val="List Table 5 Dark - Accent 2"/>
-    <w:basedOn w:val="666"/>
+    <w:basedOn w:val="889"/>
     <w:uiPriority w:val="99"/>
     <w:pPr>
       <w:pBdr/>
@@ -21744,9 +21861,9 @@
       </w:tcPr>
     </w:tblStylePr>
   </w:style>
-  <w:style w:type="table" w:styleId="99">
+  <w:style w:type="table" w:styleId="788">
     <w:name w:val="List Table 5 Dark - Accent 3"/>
-    <w:basedOn w:val="666"/>
+    <w:basedOn w:val="889"/>
     <w:uiPriority w:val="99"/>
     <w:pPr>
       <w:pBdr/>
@@ -21986,9 +22103,9 @@
       </w:tcPr>
     </w:tblStylePr>
   </w:style>
-  <w:style w:type="table" w:styleId="100">
+  <w:style w:type="table" w:styleId="789">
     <w:name w:val="List Table 5 Dark - Accent 4"/>
-    <w:basedOn w:val="666"/>
+    <w:basedOn w:val="889"/>
     <w:uiPriority w:val="99"/>
     <w:pPr>
       <w:pBdr/>
@@ -22228,9 +22345,9 @@
       </w:tcPr>
     </w:tblStylePr>
   </w:style>
-  <w:style w:type="table" w:styleId="101">
+  <w:style w:type="table" w:styleId="790">
     <w:name w:val="List Table 5 Dark - Accent 5"/>
-    <w:basedOn w:val="666"/>
+    <w:basedOn w:val="889"/>
     <w:uiPriority w:val="99"/>
     <w:pPr>
       <w:pBdr/>
@@ -22470,9 +22587,9 @@
       </w:tcPr>
     </w:tblStylePr>
   </w:style>
-  <w:style w:type="table" w:styleId="102">
+  <w:style w:type="table" w:styleId="791">
     <w:name w:val="List Table 5 Dark - Accent 6"/>
-    <w:basedOn w:val="666"/>
+    <w:basedOn w:val="889"/>
     <w:uiPriority w:val="99"/>
     <w:pPr>
       <w:pBdr/>
@@ -22712,9 +22829,9 @@
       </w:tcPr>
     </w:tblStylePr>
   </w:style>
-  <w:style w:type="table" w:styleId="103">
+  <w:style w:type="table" w:styleId="792">
     <w:name w:val="List Table 6 Colorful"/>
-    <w:basedOn w:val="666"/>
+    <w:basedOn w:val="889"/>
     <w:uiPriority w:val="99"/>
     <w:pPr>
       <w:pBdr/>
@@ -22935,9 +23052,9 @@
       </w:tcPr>
     </w:tblStylePr>
   </w:style>
-  <w:style w:type="table" w:styleId="104">
+  <w:style w:type="table" w:styleId="793">
     <w:name w:val="List Table 6 Colorful - Accent 1"/>
-    <w:basedOn w:val="666"/>
+    <w:basedOn w:val="889"/>
     <w:uiPriority w:val="99"/>
     <w:pPr>
       <w:pBdr/>
@@ -23158,9 +23275,9 @@
       </w:tcPr>
     </w:tblStylePr>
   </w:style>
-  <w:style w:type="table" w:styleId="105">
+  <w:style w:type="table" w:styleId="794">
     <w:name w:val="List Table 6 Colorful - Accent 2"/>
-    <w:basedOn w:val="666"/>
+    <w:basedOn w:val="889"/>
     <w:uiPriority w:val="99"/>
     <w:pPr>
       <w:pBdr/>
@@ -23381,9 +23498,9 @@
       </w:tcPr>
     </w:tblStylePr>
   </w:style>
-  <w:style w:type="table" w:styleId="106">
+  <w:style w:type="table" w:styleId="795">
     <w:name w:val="List Table 6 Colorful - Accent 3"/>
-    <w:basedOn w:val="666"/>
+    <w:basedOn w:val="889"/>
     <w:uiPriority w:val="99"/>
     <w:pPr>
       <w:pBdr/>
@@ -23604,9 +23721,9 @@
       </w:tcPr>
     </w:tblStylePr>
   </w:style>
-  <w:style w:type="table" w:styleId="107">
+  <w:style w:type="table" w:styleId="796">
     <w:name w:val="List Table 6 Colorful - Accent 4"/>
-    <w:basedOn w:val="666"/>
+    <w:basedOn w:val="889"/>
     <w:uiPriority w:val="99"/>
     <w:pPr>
       <w:pBdr/>
@@ -23827,9 +23944,9 @@
       </w:tcPr>
     </w:tblStylePr>
   </w:style>
-  <w:style w:type="table" w:styleId="108">
+  <w:style w:type="table" w:styleId="797">
     <w:name w:val="List Table 6 Colorful - Accent 5"/>
-    <w:basedOn w:val="666"/>
+    <w:basedOn w:val="889"/>
     <w:uiPriority w:val="99"/>
     <w:pPr>
       <w:pBdr/>
@@ -24050,9 +24167,9 @@
       </w:tcPr>
     </w:tblStylePr>
   </w:style>
-  <w:style w:type="table" w:styleId="109">
+  <w:style w:type="table" w:styleId="798">
     <w:name w:val="List Table 6 Colorful - Accent 6"/>
-    <w:basedOn w:val="666"/>
+    <w:basedOn w:val="889"/>
     <w:uiPriority w:val="99"/>
     <w:pPr>
       <w:pBdr/>
@@ -24273,9 +24390,9 @@
       </w:tcPr>
     </w:tblStylePr>
   </w:style>
-  <w:style w:type="table" w:styleId="110">
+  <w:style w:type="table" w:styleId="799">
     <w:name w:val="List Table 7 Colorful"/>
-    <w:basedOn w:val="666"/>
+    <w:basedOn w:val="889"/>
     <w:uiPriority w:val="99"/>
     <w:pPr>
       <w:pBdr/>
@@ -24374,11 +24491,11 @@
         <w:tblBorders/>
       </w:tblPr>
       <w:tcPr>
-        <w:shd w:color="ffffff"/>
+        <w:shd w:val="clear" w:color="ffffff"/>
         <w:tcBorders>
-          <w:top w:val="none"/>
-          <w:left w:val="none"/>
-          <w:bottom w:val="none"/>
+          <w:top w:val="none" w:color="000000" w:sz="4" w:space="0"/>
+          <w:left w:val="none" w:color="000000" w:sz="4" w:space="0"/>
+          <w:bottom w:val="none" w:color="000000" w:sz="4" w:space="0"/>
           <w:right w:val="single" w:color="000000" w:themeColor="text1" w:themeTint="80" w:sz="4" w:space="0"/>
         </w:tcBorders>
       </w:tcPr>
@@ -24401,10 +24518,10 @@
       <w:tcPr>
         <w:shd w:val="clear" w:color="ffffff" w:themeColor="light1" w:fill="ffffff" w:themeFill="light1"/>
         <w:tcBorders>
-          <w:top w:val="none"/>
-          <w:left w:val="none"/>
+          <w:top w:val="none" w:color="000000" w:sz="4" w:space="0"/>
+          <w:left w:val="none" w:color="000000" w:sz="4" w:space="0"/>
           <w:bottom w:val="single" w:color="000000" w:themeColor="text1" w:themeTint="80" w:sz="4" w:space="0"/>
-          <w:right w:val="none"/>
+          <w:right w:val="none" w:color="000000" w:sz="4" w:space="0"/>
         </w:tcBorders>
       </w:tcPr>
     </w:tblStylePr>
@@ -24424,12 +24541,12 @@
         <w:tblBorders/>
       </w:tblPr>
       <w:tcPr>
-        <w:shd w:color="ffffff"/>
+        <w:shd w:val="clear" w:color="ffffff"/>
         <w:tcBorders>
-          <w:top w:val="none"/>
+          <w:top w:val="none" w:color="000000" w:sz="4" w:space="0"/>
           <w:left w:val="single" w:color="000000" w:themeColor="text1" w:themeTint="80" w:sz="4" w:space="0"/>
-          <w:bottom w:val="none"/>
-          <w:right w:val="none"/>
+          <w:bottom w:val="none" w:color="000000" w:sz="4" w:space="0"/>
+          <w:right w:val="none" w:color="000000" w:sz="4" w:space="0"/>
         </w:tcBorders>
       </w:tcPr>
     </w:tblStylePr>
@@ -24452,9 +24569,9 @@
         <w:shd w:val="clear" w:color="ffffff" w:themeColor="light1" w:fill="ffffff" w:themeFill="light1"/>
         <w:tcBorders>
           <w:top w:val="single" w:color="000000" w:themeColor="text1" w:themeTint="80" w:sz="4" w:space="0"/>
-          <w:left w:val="none"/>
-          <w:bottom w:val="none"/>
-          <w:right w:val="none"/>
+          <w:left w:val="none" w:color="000000" w:sz="4" w:space="0"/>
+          <w:bottom w:val="none" w:color="000000" w:sz="4" w:space="0"/>
+          <w:right w:val="none" w:color="000000" w:sz="4" w:space="0"/>
         </w:tcBorders>
       </w:tcPr>
     </w:tblStylePr>
@@ -24529,9 +24646,9 @@
       </w:tcPr>
     </w:tblStylePr>
   </w:style>
-  <w:style w:type="table" w:styleId="111">
+  <w:style w:type="table" w:styleId="800">
     <w:name w:val="List Table 7 Colorful - Accent 1"/>
-    <w:basedOn w:val="666"/>
+    <w:basedOn w:val="889"/>
     <w:uiPriority w:val="99"/>
     <w:pPr>
       <w:pBdr/>
@@ -24630,11 +24747,11 @@
         <w:tblBorders/>
       </w:tblPr>
       <w:tcPr>
-        <w:shd w:color="ffffff"/>
+        <w:shd w:val="clear" w:color="ffffff"/>
         <w:tcBorders>
-          <w:top w:val="none"/>
-          <w:left w:val="none"/>
-          <w:bottom w:val="none"/>
+          <w:top w:val="none" w:color="000000" w:sz="4" w:space="0"/>
+          <w:left w:val="none" w:color="000000" w:sz="4" w:space="0"/>
+          <w:bottom w:val="none" w:color="000000" w:sz="4" w:space="0"/>
           <w:right w:val="single" w:color="000000" w:themeColor="accent1" w:sz="4" w:space="0"/>
         </w:tcBorders>
       </w:tcPr>
@@ -24657,10 +24774,10 @@
       <w:tcPr>
         <w:shd w:val="clear" w:color="ffffff" w:themeColor="light1" w:fill="ffffff" w:themeFill="light1"/>
         <w:tcBorders>
-          <w:top w:val="none"/>
-          <w:left w:val="none"/>
+          <w:top w:val="none" w:color="000000" w:sz="4" w:space="0"/>
+          <w:left w:val="none" w:color="000000" w:sz="4" w:space="0"/>
           <w:bottom w:val="single" w:color="000000" w:themeColor="accent1" w:sz="4" w:space="0"/>
-          <w:right w:val="none"/>
+          <w:right w:val="none" w:color="000000" w:sz="4" w:space="0"/>
         </w:tcBorders>
       </w:tcPr>
     </w:tblStylePr>
@@ -24680,12 +24797,12 @@
         <w:tblBorders/>
       </w:tblPr>
       <w:tcPr>
-        <w:shd w:color="ffffff"/>
+        <w:shd w:val="clear" w:color="ffffff"/>
         <w:tcBorders>
-          <w:top w:val="none"/>
+          <w:top w:val="none" w:color="000000" w:sz="4" w:space="0"/>
           <w:left w:val="single" w:color="000000" w:themeColor="accent1" w:sz="4" w:space="0"/>
-          <w:bottom w:val="none"/>
-          <w:right w:val="none"/>
+          <w:bottom w:val="none" w:color="000000" w:sz="4" w:space="0"/>
+          <w:right w:val="none" w:color="000000" w:sz="4" w:space="0"/>
         </w:tcBorders>
       </w:tcPr>
     </w:tblStylePr>
@@ -24708,9 +24825,9 @@
         <w:shd w:val="clear" w:color="ffffff" w:themeColor="light1" w:fill="ffffff" w:themeFill="light1"/>
         <w:tcBorders>
           <w:top w:val="single" w:color="000000" w:themeColor="accent1" w:sz="4" w:space="0"/>
-          <w:left w:val="none"/>
-          <w:bottom w:val="none"/>
-          <w:right w:val="none"/>
+          <w:left w:val="none" w:color="000000" w:sz="4" w:space="0"/>
+          <w:bottom w:val="none" w:color="000000" w:sz="4" w:space="0"/>
+          <w:right w:val="none" w:color="000000" w:sz="4" w:space="0"/>
         </w:tcBorders>
       </w:tcPr>
     </w:tblStylePr>
@@ -24785,9 +24902,9 @@
       </w:tcPr>
     </w:tblStylePr>
   </w:style>
-  <w:style w:type="table" w:styleId="112">
+  <w:style w:type="table" w:styleId="801">
     <w:name w:val="List Table 7 Colorful - Accent 2"/>
-    <w:basedOn w:val="666"/>
+    <w:basedOn w:val="889"/>
     <w:uiPriority w:val="99"/>
     <w:pPr>
       <w:pBdr/>
@@ -24886,11 +25003,11 @@
         <w:tblBorders/>
       </w:tblPr>
       <w:tcPr>
-        <w:shd w:color="ffffff"/>
+        <w:shd w:val="clear" w:color="ffffff"/>
         <w:tcBorders>
-          <w:top w:val="none"/>
-          <w:left w:val="none"/>
-          <w:bottom w:val="none"/>
+          <w:top w:val="none" w:color="000000" w:sz="4" w:space="0"/>
+          <w:left w:val="none" w:color="000000" w:sz="4" w:space="0"/>
+          <w:bottom w:val="none" w:color="000000" w:sz="4" w:space="0"/>
           <w:right w:val="single" w:color="000000" w:themeColor="accent2" w:themeTint="97" w:sz="4" w:space="0"/>
         </w:tcBorders>
       </w:tcPr>
@@ -24913,10 +25030,10 @@
       <w:tcPr>
         <w:shd w:val="clear" w:color="ffffff" w:themeColor="light1" w:fill="ffffff" w:themeFill="light1"/>
         <w:tcBorders>
-          <w:top w:val="none"/>
-          <w:left w:val="none"/>
+          <w:top w:val="none" w:color="000000" w:sz="4" w:space="0"/>
+          <w:left w:val="none" w:color="000000" w:sz="4" w:space="0"/>
           <w:bottom w:val="single" w:color="000000" w:themeColor="accent2" w:themeTint="97" w:sz="4" w:space="0"/>
-          <w:right w:val="none"/>
+          <w:right w:val="none" w:color="000000" w:sz="4" w:space="0"/>
         </w:tcBorders>
       </w:tcPr>
     </w:tblStylePr>
@@ -24936,12 +25053,12 @@
         <w:tblBorders/>
       </w:tblPr>
       <w:tcPr>
-        <w:shd w:color="ffffff"/>
+        <w:shd w:val="clear" w:color="ffffff"/>
         <w:tcBorders>
-          <w:top w:val="none"/>
+          <w:top w:val="none" w:color="000000" w:sz="4" w:space="0"/>
           <w:left w:val="single" w:color="000000" w:themeColor="accent2" w:themeTint="97" w:sz="4" w:space="0"/>
-          <w:bottom w:val="none"/>
-          <w:right w:val="none"/>
+          <w:bottom w:val="none" w:color="000000" w:sz="4" w:space="0"/>
+          <w:right w:val="none" w:color="000000" w:sz="4" w:space="0"/>
         </w:tcBorders>
       </w:tcPr>
     </w:tblStylePr>
@@ -24964,9 +25081,9 @@
         <w:shd w:val="clear" w:color="ffffff" w:themeColor="light1" w:fill="ffffff" w:themeFill="light1"/>
         <w:tcBorders>
           <w:top w:val="single" w:color="000000" w:themeColor="accent2" w:themeTint="97" w:sz="4" w:space="0"/>
-          <w:left w:val="none"/>
-          <w:bottom w:val="none"/>
-          <w:right w:val="none"/>
+          <w:left w:val="none" w:color="000000" w:sz="4" w:space="0"/>
+          <w:bottom w:val="none" w:color="000000" w:sz="4" w:space="0"/>
+          <w:right w:val="none" w:color="000000" w:sz="4" w:space="0"/>
         </w:tcBorders>
       </w:tcPr>
     </w:tblStylePr>
@@ -25041,9 +25158,9 @@
       </w:tcPr>
     </w:tblStylePr>
   </w:style>
-  <w:style w:type="table" w:styleId="113">
+  <w:style w:type="table" w:styleId="802">
     <w:name w:val="List Table 7 Colorful - Accent 3"/>
-    <w:basedOn w:val="666"/>
+    <w:basedOn w:val="889"/>
     <w:uiPriority w:val="99"/>
     <w:pPr>
       <w:pBdr/>
@@ -25142,11 +25259,11 @@
         <w:tblBorders/>
       </w:tblPr>
       <w:tcPr>
-        <w:shd w:color="ffffff"/>
+        <w:shd w:val="clear" w:color="ffffff"/>
         <w:tcBorders>
-          <w:top w:val="none"/>
-          <w:left w:val="none"/>
-          <w:bottom w:val="none"/>
+          <w:top w:val="none" w:color="000000" w:sz="4" w:space="0"/>
+          <w:left w:val="none" w:color="000000" w:sz="4" w:space="0"/>
+          <w:bottom w:val="none" w:color="000000" w:sz="4" w:space="0"/>
           <w:right w:val="single" w:color="000000" w:themeColor="accent3" w:themeTint="98" w:sz="4" w:space="0"/>
         </w:tcBorders>
       </w:tcPr>
@@ -25169,10 +25286,10 @@
       <w:tcPr>
         <w:shd w:val="clear" w:color="ffffff" w:themeColor="light1" w:fill="ffffff" w:themeFill="light1"/>
         <w:tcBorders>
-          <w:top w:val="none"/>
-          <w:left w:val="none"/>
+          <w:top w:val="none" w:color="000000" w:sz="4" w:space="0"/>
+          <w:left w:val="none" w:color="000000" w:sz="4" w:space="0"/>
           <w:bottom w:val="single" w:color="000000" w:themeColor="accent3" w:themeTint="98" w:sz="4" w:space="0"/>
-          <w:right w:val="none"/>
+          <w:right w:val="none" w:color="000000" w:sz="4" w:space="0"/>
         </w:tcBorders>
       </w:tcPr>
     </w:tblStylePr>
@@ -25192,12 +25309,12 @@
         <w:tblBorders/>
       </w:tblPr>
       <w:tcPr>
-        <w:shd w:color="ffffff"/>
+        <w:shd w:val="clear" w:color="ffffff"/>
         <w:tcBorders>
-          <w:top w:val="none"/>
+          <w:top w:val="none" w:color="000000" w:sz="4" w:space="0"/>
           <w:left w:val="single" w:color="000000" w:themeColor="accent3" w:themeTint="98" w:sz="4" w:space="0"/>
-          <w:bottom w:val="none"/>
-          <w:right w:val="none"/>
+          <w:bottom w:val="none" w:color="000000" w:sz="4" w:space="0"/>
+          <w:right w:val="none" w:color="000000" w:sz="4" w:space="0"/>
         </w:tcBorders>
       </w:tcPr>
     </w:tblStylePr>
@@ -25220,9 +25337,9 @@
         <w:shd w:val="clear" w:color="ffffff" w:themeColor="light1" w:fill="ffffff" w:themeFill="light1"/>
         <w:tcBorders>
           <w:top w:val="single" w:color="000000" w:themeColor="accent3" w:themeTint="98" w:sz="4" w:space="0"/>
-          <w:left w:val="none"/>
-          <w:bottom w:val="none"/>
-          <w:right w:val="none"/>
+          <w:left w:val="none" w:color="000000" w:sz="4" w:space="0"/>
+          <w:bottom w:val="none" w:color="000000" w:sz="4" w:space="0"/>
+          <w:right w:val="none" w:color="000000" w:sz="4" w:space="0"/>
         </w:tcBorders>
       </w:tcPr>
     </w:tblStylePr>
@@ -25297,9 +25414,9 @@
       </w:tcPr>
     </w:tblStylePr>
   </w:style>
-  <w:style w:type="table" w:styleId="114">
+  <w:style w:type="table" w:styleId="803">
     <w:name w:val="List Table 7 Colorful - Accent 4"/>
-    <w:basedOn w:val="666"/>
+    <w:basedOn w:val="889"/>
     <w:uiPriority w:val="99"/>
     <w:pPr>
       <w:pBdr/>
@@ -25398,11 +25515,11 @@
         <w:tblBorders/>
       </w:tblPr>
       <w:tcPr>
-        <w:shd w:color="ffffff"/>
+        <w:shd w:val="clear" w:color="ffffff"/>
         <w:tcBorders>
-          <w:top w:val="none"/>
-          <w:left w:val="none"/>
-          <w:bottom w:val="none"/>
+          <w:top w:val="none" w:color="000000" w:sz="4" w:space="0"/>
+          <w:left w:val="none" w:color="000000" w:sz="4" w:space="0"/>
+          <w:bottom w:val="none" w:color="000000" w:sz="4" w:space="0"/>
           <w:right w:val="single" w:color="000000" w:themeColor="accent4" w:themeTint="9A" w:sz="4" w:space="0"/>
         </w:tcBorders>
       </w:tcPr>
@@ -25425,10 +25542,10 @@
       <w:tcPr>
         <w:shd w:val="clear" w:color="ffffff" w:themeColor="light1" w:fill="ffffff" w:themeFill="light1"/>
         <w:tcBorders>
-          <w:top w:val="none"/>
-          <w:left w:val="none"/>
+          <w:top w:val="none" w:color="000000" w:sz="4" w:space="0"/>
+          <w:left w:val="none" w:color="000000" w:sz="4" w:space="0"/>
           <w:bottom w:val="single" w:color="000000" w:themeColor="accent4" w:themeTint="9A" w:sz="4" w:space="0"/>
-          <w:right w:val="none"/>
+          <w:right w:val="none" w:color="000000" w:sz="4" w:space="0"/>
         </w:tcBorders>
       </w:tcPr>
     </w:tblStylePr>
@@ -25448,12 +25565,12 @@
         <w:tblBorders/>
       </w:tblPr>
       <w:tcPr>
-        <w:shd w:color="ffffff"/>
+        <w:shd w:val="clear" w:color="ffffff"/>
         <w:tcBorders>
-          <w:top w:val="none"/>
+          <w:top w:val="none" w:color="000000" w:sz="4" w:space="0"/>
           <w:left w:val="single" w:color="000000" w:themeColor="accent4" w:themeTint="9A" w:sz="4" w:space="0"/>
-          <w:bottom w:val="none"/>
-          <w:right w:val="none"/>
+          <w:bottom w:val="none" w:color="000000" w:sz="4" w:space="0"/>
+          <w:right w:val="none" w:color="000000" w:sz="4" w:space="0"/>
         </w:tcBorders>
       </w:tcPr>
     </w:tblStylePr>
@@ -25476,9 +25593,9 @@
         <w:shd w:val="clear" w:color="ffffff" w:themeColor="light1" w:fill="ffffff" w:themeFill="light1"/>
         <w:tcBorders>
           <w:top w:val="single" w:color="000000" w:themeColor="accent4" w:themeTint="9A" w:sz="4" w:space="0"/>
-          <w:left w:val="none"/>
-          <w:bottom w:val="none"/>
-          <w:right w:val="none"/>
+          <w:left w:val="none" w:color="000000" w:sz="4" w:space="0"/>
+          <w:bottom w:val="none" w:color="000000" w:sz="4" w:space="0"/>
+          <w:right w:val="none" w:color="000000" w:sz="4" w:space="0"/>
         </w:tcBorders>
       </w:tcPr>
     </w:tblStylePr>
@@ -25553,9 +25670,9 @@
       </w:tcPr>
     </w:tblStylePr>
   </w:style>
-  <w:style w:type="table" w:styleId="115">
+  <w:style w:type="table" w:styleId="804">
     <w:name w:val="List Table 7 Colorful - Accent 5"/>
-    <w:basedOn w:val="666"/>
+    <w:basedOn w:val="889"/>
     <w:uiPriority w:val="99"/>
     <w:pPr>
       <w:pBdr/>
@@ -25654,11 +25771,11 @@
         <w:tblBorders/>
       </w:tblPr>
       <w:tcPr>
-        <w:shd w:color="ffffff"/>
+        <w:shd w:val="clear" w:color="ffffff"/>
         <w:tcBorders>
-          <w:top w:val="none"/>
-          <w:left w:val="none"/>
-          <w:bottom w:val="none"/>
+          <w:top w:val="none" w:color="000000" w:sz="4" w:space="0"/>
+          <w:left w:val="none" w:color="000000" w:sz="4" w:space="0"/>
+          <w:bottom w:val="none" w:color="000000" w:sz="4" w:space="0"/>
           <w:right w:val="single" w:color="000000" w:themeColor="accent5" w:themeTint="9A" w:sz="4" w:space="0"/>
         </w:tcBorders>
       </w:tcPr>
@@ -25681,10 +25798,10 @@
       <w:tcPr>
         <w:shd w:val="clear" w:color="ffffff" w:themeColor="light1" w:fill="ffffff" w:themeFill="light1"/>
         <w:tcBorders>
-          <w:top w:val="none"/>
-          <w:left w:val="none"/>
+          <w:top w:val="none" w:color="000000" w:sz="4" w:space="0"/>
+          <w:left w:val="none" w:color="000000" w:sz="4" w:space="0"/>
           <w:bottom w:val="single" w:color="000000" w:themeColor="accent5" w:themeTint="9A" w:sz="4" w:space="0"/>
-          <w:right w:val="none"/>
+          <w:right w:val="none" w:color="000000" w:sz="4" w:space="0"/>
         </w:tcBorders>
       </w:tcPr>
     </w:tblStylePr>
@@ -25704,12 +25821,12 @@
         <w:tblBorders/>
       </w:tblPr>
       <w:tcPr>
-        <w:shd w:color="ffffff"/>
+        <w:shd w:val="clear" w:color="ffffff"/>
         <w:tcBorders>
-          <w:top w:val="none"/>
+          <w:top w:val="none" w:color="000000" w:sz="4" w:space="0"/>
           <w:left w:val="single" w:color="000000" w:themeColor="accent5" w:themeTint="9A" w:sz="4" w:space="0"/>
-          <w:bottom w:val="none"/>
-          <w:right w:val="none"/>
+          <w:bottom w:val="none" w:color="000000" w:sz="4" w:space="0"/>
+          <w:right w:val="none" w:color="000000" w:sz="4" w:space="0"/>
         </w:tcBorders>
       </w:tcPr>
     </w:tblStylePr>
@@ -25732,9 +25849,9 @@
         <w:shd w:val="clear" w:color="ffffff" w:themeColor="light1" w:fill="ffffff" w:themeFill="light1"/>
         <w:tcBorders>
           <w:top w:val="single" w:color="000000" w:themeColor="accent5" w:themeTint="9A" w:sz="4" w:space="0"/>
-          <w:left w:val="none"/>
-          <w:bottom w:val="none"/>
-          <w:right w:val="none"/>
+          <w:left w:val="none" w:color="000000" w:sz="4" w:space="0"/>
+          <w:bottom w:val="none" w:color="000000" w:sz="4" w:space="0"/>
+          <w:right w:val="none" w:color="000000" w:sz="4" w:space="0"/>
         </w:tcBorders>
       </w:tcPr>
     </w:tblStylePr>
@@ -25809,9 +25926,9 @@
       </w:tcPr>
     </w:tblStylePr>
   </w:style>
-  <w:style w:type="table" w:styleId="116">
+  <w:style w:type="table" w:styleId="805">
     <w:name w:val="List Table 7 Colorful - Accent 6"/>
-    <w:basedOn w:val="666"/>
+    <w:basedOn w:val="889"/>
     <w:uiPriority w:val="99"/>
     <w:pPr>
       <w:pBdr/>
@@ -25910,11 +26027,11 @@
         <w:tblBorders/>
       </w:tblPr>
       <w:tcPr>
-        <w:shd w:color="ffffff"/>
+        <w:shd w:val="clear" w:color="ffffff"/>
         <w:tcBorders>
-          <w:top w:val="none"/>
-          <w:left w:val="none"/>
-          <w:bottom w:val="none"/>
+          <w:top w:val="none" w:color="000000" w:sz="4" w:space="0"/>
+          <w:left w:val="none" w:color="000000" w:sz="4" w:space="0"/>
+          <w:bottom w:val="none" w:color="000000" w:sz="4" w:space="0"/>
           <w:right w:val="single" w:color="000000" w:themeColor="accent6" w:themeTint="98" w:sz="4" w:space="0"/>
         </w:tcBorders>
       </w:tcPr>
@@ -25937,10 +26054,10 @@
       <w:tcPr>
         <w:shd w:val="clear" w:color="ffffff" w:themeColor="light1" w:fill="ffffff" w:themeFill="light1"/>
         <w:tcBorders>
-          <w:top w:val="none"/>
-          <w:left w:val="none"/>
+          <w:top w:val="none" w:color="000000" w:sz="4" w:space="0"/>
+          <w:left w:val="none" w:color="000000" w:sz="4" w:space="0"/>
           <w:bottom w:val="single" w:color="000000" w:themeColor="accent6" w:themeTint="98" w:sz="4" w:space="0"/>
-          <w:right w:val="none"/>
+          <w:right w:val="none" w:color="000000" w:sz="4" w:space="0"/>
         </w:tcBorders>
       </w:tcPr>
     </w:tblStylePr>
@@ -25960,12 +26077,12 @@
         <w:tblBorders/>
       </w:tblPr>
       <w:tcPr>
-        <w:shd w:color="ffffff"/>
+        <w:shd w:val="clear" w:color="ffffff"/>
         <w:tcBorders>
-          <w:top w:val="none"/>
+          <w:top w:val="none" w:color="000000" w:sz="4" w:space="0"/>
           <w:left w:val="single" w:color="000000" w:themeColor="accent6" w:themeTint="98" w:sz="4" w:space="0"/>
-          <w:bottom w:val="none"/>
-          <w:right w:val="none"/>
+          <w:bottom w:val="none" w:color="000000" w:sz="4" w:space="0"/>
+          <w:right w:val="none" w:color="000000" w:sz="4" w:space="0"/>
         </w:tcBorders>
       </w:tcPr>
     </w:tblStylePr>
@@ -25988,9 +26105,9 @@
         <w:shd w:val="clear" w:color="ffffff" w:themeColor="light1" w:fill="ffffff" w:themeFill="light1"/>
         <w:tcBorders>
           <w:top w:val="single" w:color="000000" w:themeColor="accent6" w:themeTint="98" w:sz="4" w:space="0"/>
-          <w:left w:val="none"/>
-          <w:bottom w:val="none"/>
-          <w:right w:val="none"/>
+          <w:left w:val="none" w:color="000000" w:sz="4" w:space="0"/>
+          <w:bottom w:val="none" w:color="000000" w:sz="4" w:space="0"/>
+          <w:right w:val="none" w:color="000000" w:sz="4" w:space="0"/>
         </w:tcBorders>
       </w:tcPr>
     </w:tblStylePr>
@@ -26065,9 +26182,9 @@
       </w:tcPr>
     </w:tblStylePr>
   </w:style>
-  <w:style w:type="table" w:styleId="117">
+  <w:style w:type="table" w:styleId="806">
     <w:name w:val="Lined - Accent"/>
-    <w:basedOn w:val="666"/>
+    <w:basedOn w:val="889"/>
     <w:uiPriority w:val="99"/>
     <w:pPr>
       <w:pBdr/>
@@ -26302,9 +26419,9 @@
       </w:tcPr>
     </w:tblStylePr>
   </w:style>
-  <w:style w:type="table" w:styleId="118">
+  <w:style w:type="table" w:styleId="807">
     <w:name w:val="Lined - Accent 1"/>
-    <w:basedOn w:val="666"/>
+    <w:basedOn w:val="889"/>
     <w:uiPriority w:val="99"/>
     <w:pPr>
       <w:pBdr/>
@@ -26539,9 +26656,9 @@
       </w:tcPr>
     </w:tblStylePr>
   </w:style>
-  <w:style w:type="table" w:styleId="119">
+  <w:style w:type="table" w:styleId="808">
     <w:name w:val="Lined - Accent 2"/>
-    <w:basedOn w:val="666"/>
+    <w:basedOn w:val="889"/>
     <w:uiPriority w:val="99"/>
     <w:pPr>
       <w:pBdr/>
@@ -26776,9 +26893,9 @@
       </w:tcPr>
     </w:tblStylePr>
   </w:style>
-  <w:style w:type="table" w:styleId="120">
+  <w:style w:type="table" w:styleId="809">
     <w:name w:val="Lined - Accent 3"/>
-    <w:basedOn w:val="666"/>
+    <w:basedOn w:val="889"/>
     <w:uiPriority w:val="99"/>
     <w:pPr>
       <w:pBdr/>
@@ -27013,9 +27130,9 @@
       </w:tcPr>
     </w:tblStylePr>
   </w:style>
-  <w:style w:type="table" w:styleId="121">
+  <w:style w:type="table" w:styleId="810">
     <w:name w:val="Lined - Accent 4"/>
-    <w:basedOn w:val="666"/>
+    <w:basedOn w:val="889"/>
     <w:uiPriority w:val="99"/>
     <w:pPr>
       <w:pBdr/>
@@ -27250,9 +27367,9 @@
       </w:tcPr>
     </w:tblStylePr>
   </w:style>
-  <w:style w:type="table" w:styleId="122">
+  <w:style w:type="table" w:styleId="811">
     <w:name w:val="Lined - Accent 5"/>
-    <w:basedOn w:val="666"/>
+    <w:basedOn w:val="889"/>
     <w:uiPriority w:val="99"/>
     <w:pPr>
       <w:pBdr/>
@@ -27487,9 +27604,9 @@
       </w:tcPr>
     </w:tblStylePr>
   </w:style>
-  <w:style w:type="table" w:styleId="123">
+  <w:style w:type="table" w:styleId="812">
     <w:name w:val="Lined - Accent 6"/>
-    <w:basedOn w:val="666"/>
+    <w:basedOn w:val="889"/>
     <w:uiPriority w:val="99"/>
     <w:pPr>
       <w:pBdr/>
@@ -27724,9 +27841,9 @@
       </w:tcPr>
     </w:tblStylePr>
   </w:style>
-  <w:style w:type="table" w:styleId="124">
+  <w:style w:type="table" w:styleId="813">
     <w:name w:val="Bordered &amp; Lined - Accent"/>
-    <w:basedOn w:val="666"/>
+    <w:basedOn w:val="889"/>
     <w:uiPriority w:val="99"/>
     <w:pPr>
       <w:pBdr/>
@@ -27968,9 +28085,9 @@
       </w:tcPr>
     </w:tblStylePr>
   </w:style>
-  <w:style w:type="table" w:styleId="125">
+  <w:style w:type="table" w:styleId="814">
     <w:name w:val="Bordered &amp; Lined - Accent 1"/>
-    <w:basedOn w:val="666"/>
+    <w:basedOn w:val="889"/>
     <w:uiPriority w:val="99"/>
     <w:pPr>
       <w:pBdr/>
@@ -28212,9 +28329,9 @@
       </w:tcPr>
     </w:tblStylePr>
   </w:style>
-  <w:style w:type="table" w:styleId="126">
+  <w:style w:type="table" w:styleId="815">
     <w:name w:val="Bordered &amp; Lined - Accent 2"/>
-    <w:basedOn w:val="666"/>
+    <w:basedOn w:val="889"/>
     <w:uiPriority w:val="99"/>
     <w:pPr>
       <w:pBdr/>
@@ -28456,9 +28573,9 @@
       </w:tcPr>
     </w:tblStylePr>
   </w:style>
-  <w:style w:type="table" w:styleId="127">
+  <w:style w:type="table" w:styleId="816">
     <w:name w:val="Bordered &amp; Lined - Accent 3"/>
-    <w:basedOn w:val="666"/>
+    <w:basedOn w:val="889"/>
     <w:uiPriority w:val="99"/>
     <w:pPr>
       <w:pBdr/>
@@ -28700,9 +28817,9 @@
       </w:tcPr>
     </w:tblStylePr>
   </w:style>
-  <w:style w:type="table" w:styleId="128">
+  <w:style w:type="table" w:styleId="817">
     <w:name w:val="Bordered &amp; Lined - Accent 4"/>
-    <w:basedOn w:val="666"/>
+    <w:basedOn w:val="889"/>
     <w:uiPriority w:val="99"/>
     <w:pPr>
       <w:pBdr/>
@@ -28944,9 +29061,9 @@
       </w:tcPr>
     </w:tblStylePr>
   </w:style>
-  <w:style w:type="table" w:styleId="129">
+  <w:style w:type="table" w:styleId="818">
     <w:name w:val="Bordered &amp; Lined - Accent 5"/>
-    <w:basedOn w:val="666"/>
+    <w:basedOn w:val="889"/>
     <w:uiPriority w:val="99"/>
     <w:pPr>
       <w:pBdr/>
@@ -29188,9 +29305,9 @@
       </w:tcPr>
     </w:tblStylePr>
   </w:style>
-  <w:style w:type="table" w:styleId="130">
+  <w:style w:type="table" w:styleId="819">
     <w:name w:val="Bordered &amp; Lined - Accent 6"/>
-    <w:basedOn w:val="666"/>
+    <w:basedOn w:val="889"/>
     <w:uiPriority w:val="99"/>
     <w:pPr>
       <w:pBdr/>
@@ -29432,9 +29549,9 @@
       </w:tcPr>
     </w:tblStylePr>
   </w:style>
-  <w:style w:type="table" w:styleId="131">
+  <w:style w:type="table" w:styleId="820">
     <w:name w:val="Bordered"/>
-    <w:basedOn w:val="666"/>
+    <w:basedOn w:val="889"/>
     <w:uiPriority w:val="99"/>
     <w:pPr>
       <w:pBdr/>
@@ -29663,9 +29780,9 @@
       </w:tcPr>
     </w:tblStylePr>
   </w:style>
-  <w:style w:type="table" w:styleId="132">
+  <w:style w:type="table" w:styleId="821">
     <w:name w:val="Bordered - Accent 1"/>
-    <w:basedOn w:val="666"/>
+    <w:basedOn w:val="889"/>
     <w:uiPriority w:val="99"/>
     <w:pPr>
       <w:pBdr/>
@@ -29894,9 +30011,9 @@
       </w:tcPr>
     </w:tblStylePr>
   </w:style>
-  <w:style w:type="table" w:styleId="133">
+  <w:style w:type="table" w:styleId="822">
     <w:name w:val="Bordered - Accent 2"/>
-    <w:basedOn w:val="666"/>
+    <w:basedOn w:val="889"/>
     <w:uiPriority w:val="99"/>
     <w:pPr>
       <w:pBdr/>
@@ -30125,9 +30242,9 @@
       </w:tcPr>
     </w:tblStylePr>
   </w:style>
-  <w:style w:type="table" w:styleId="134">
+  <w:style w:type="table" w:styleId="823">
     <w:name w:val="Bordered - Accent 3"/>
-    <w:basedOn w:val="666"/>
+    <w:basedOn w:val="889"/>
     <w:uiPriority w:val="99"/>
     <w:pPr>
       <w:pBdr/>
@@ -30356,9 +30473,9 @@
       </w:tcPr>
     </w:tblStylePr>
   </w:style>
-  <w:style w:type="table" w:styleId="135">
+  <w:style w:type="table" w:styleId="824">
     <w:name w:val="Bordered - Accent 4"/>
-    <w:basedOn w:val="666"/>
+    <w:basedOn w:val="889"/>
     <w:uiPriority w:val="99"/>
     <w:pPr>
       <w:pBdr/>
@@ -30587,9 +30704,9 @@
       </w:tcPr>
     </w:tblStylePr>
   </w:style>
-  <w:style w:type="table" w:styleId="136">
+  <w:style w:type="table" w:styleId="825">
     <w:name w:val="Bordered - Accent 5"/>
-    <w:basedOn w:val="666"/>
+    <w:basedOn w:val="889"/>
     <w:uiPriority w:val="99"/>
     <w:pPr>
       <w:pBdr/>
@@ -30818,9 +30935,9 @@
       </w:tcPr>
     </w:tblStylePr>
   </w:style>
-  <w:style w:type="table" w:styleId="137">
+  <w:style w:type="table" w:styleId="826">
     <w:name w:val="Bordered - Accent 6"/>
-    <w:basedOn w:val="666"/>
+    <w:basedOn w:val="889"/>
     <w:uiPriority w:val="99"/>
     <w:pPr>
       <w:pBdr/>
@@ -31049,11 +31166,11 @@
       </w:tcPr>
     </w:tblStylePr>
   </w:style>
-  <w:style w:type="paragraph" w:styleId="139">
+  <w:style w:type="paragraph" w:styleId="827">
     <w:name w:val="Heading 1"/>
-    <w:basedOn w:val="664"/>
-    <w:next w:val="664"/>
-    <w:link w:val="150"/>
+    <w:basedOn w:val="887"/>
+    <w:next w:val="887"/>
+    <w:link w:val="836"/>
     <w:uiPriority w:val="9"/>
     <w:qFormat/>
     <w:pPr>
@@ -31071,11 +31188,11 @@
       <w:szCs w:val="40"/>
     </w:rPr>
   </w:style>
-  <w:style w:type="paragraph" w:styleId="140">
+  <w:style w:type="paragraph" w:styleId="828">
     <w:name w:val="Heading 2"/>
-    <w:basedOn w:val="664"/>
-    <w:next w:val="664"/>
-    <w:link w:val="151"/>
+    <w:basedOn w:val="887"/>
+    <w:next w:val="887"/>
+    <w:link w:val="837"/>
     <w:uiPriority w:val="9"/>
     <w:unhideWhenUsed/>
     <w:qFormat/>
@@ -31094,11 +31211,11 @@
       <w:szCs w:val="32"/>
     </w:rPr>
   </w:style>
-  <w:style w:type="paragraph" w:styleId="141">
+  <w:style w:type="paragraph" w:styleId="829">
     <w:name w:val="Heading 3"/>
-    <w:basedOn w:val="664"/>
-    <w:next w:val="664"/>
-    <w:link w:val="152"/>
+    <w:basedOn w:val="887"/>
+    <w:next w:val="887"/>
+    <w:link w:val="838"/>
     <w:uiPriority w:val="9"/>
     <w:unhideWhenUsed/>
     <w:qFormat/>
@@ -31117,11 +31234,11 @@
       <w:szCs w:val="28"/>
     </w:rPr>
   </w:style>
-  <w:style w:type="paragraph" w:styleId="142">
+  <w:style w:type="paragraph" w:styleId="830">
     <w:name w:val="Heading 4"/>
-    <w:basedOn w:val="664"/>
-    <w:next w:val="664"/>
-    <w:link w:val="153"/>
+    <w:basedOn w:val="887"/>
+    <w:next w:val="887"/>
+    <w:link w:val="839"/>
     <w:uiPriority w:val="9"/>
     <w:unhideWhenUsed/>
     <w:qFormat/>
@@ -31140,11 +31257,11 @@
       <w:color w:val="0f4761" w:themeColor="accent1" w:themeShade="BF"/>
     </w:rPr>
   </w:style>
-  <w:style w:type="paragraph" w:styleId="143">
+  <w:style w:type="paragraph" w:styleId="831">
     <w:name w:val="Heading 5"/>
-    <w:basedOn w:val="664"/>
-    <w:next w:val="664"/>
-    <w:link w:val="154"/>
+    <w:basedOn w:val="887"/>
+    <w:next w:val="887"/>
+    <w:link w:val="840"/>
     <w:uiPriority w:val="9"/>
     <w:unhideWhenUsed/>
     <w:qFormat/>
@@ -31161,11 +31278,11 @@
       <w:color w:val="0f4761" w:themeColor="accent1" w:themeShade="BF"/>
     </w:rPr>
   </w:style>
-  <w:style w:type="paragraph" w:styleId="144">
+  <w:style w:type="paragraph" w:styleId="832">
     <w:name w:val="Heading 6"/>
-    <w:basedOn w:val="664"/>
-    <w:next w:val="664"/>
-    <w:link w:val="155"/>
+    <w:basedOn w:val="887"/>
+    <w:next w:val="887"/>
+    <w:link w:val="841"/>
     <w:uiPriority w:val="9"/>
     <w:unhideWhenUsed/>
     <w:qFormat/>
@@ -31184,11 +31301,11 @@
       <w:color w:val="595959" w:themeColor="text1" w:themeTint="A6"/>
     </w:rPr>
   </w:style>
-  <w:style w:type="paragraph" w:styleId="145">
+  <w:style w:type="paragraph" w:styleId="833">
     <w:name w:val="Heading 7"/>
-    <w:basedOn w:val="664"/>
-    <w:next w:val="664"/>
-    <w:link w:val="156"/>
+    <w:basedOn w:val="887"/>
+    <w:next w:val="887"/>
+    <w:link w:val="842"/>
     <w:uiPriority w:val="9"/>
     <w:unhideWhenUsed/>
     <w:qFormat/>
@@ -31205,11 +31322,11 @@
       <w:color w:val="595959" w:themeColor="text1" w:themeTint="A6"/>
     </w:rPr>
   </w:style>
-  <w:style w:type="paragraph" w:styleId="146">
+  <w:style w:type="paragraph" w:styleId="834">
     <w:name w:val="Heading 8"/>
-    <w:basedOn w:val="664"/>
-    <w:next w:val="664"/>
-    <w:link w:val="157"/>
+    <w:basedOn w:val="887"/>
+    <w:next w:val="887"/>
+    <w:link w:val="843"/>
     <w:uiPriority w:val="9"/>
     <w:unhideWhenUsed/>
     <w:qFormat/>
@@ -31228,11 +31345,11 @@
       <w:color w:val="272727" w:themeColor="text1" w:themeTint="D8"/>
     </w:rPr>
   </w:style>
-  <w:style w:type="paragraph" w:styleId="147">
+  <w:style w:type="paragraph" w:styleId="835">
     <w:name w:val="Heading 9"/>
-    <w:basedOn w:val="664"/>
-    <w:next w:val="664"/>
-    <w:link w:val="158"/>
+    <w:basedOn w:val="887"/>
+    <w:next w:val="887"/>
+    <w:link w:val="844"/>
     <w:uiPriority w:val="9"/>
     <w:unhideWhenUsed/>
     <w:qFormat/>
@@ -31251,10 +31368,10 @@
       <w:color w:val="272727" w:themeColor="text1" w:themeTint="D8"/>
     </w:rPr>
   </w:style>
-  <w:style w:type="character" w:styleId="150">
+  <w:style w:type="character" w:styleId="836">
     <w:name w:val="Heading 1 Char"/>
-    <w:basedOn w:val="665"/>
-    <w:link w:val="139"/>
+    <w:basedOn w:val="888"/>
+    <w:link w:val="827"/>
     <w:uiPriority w:val="9"/>
     <w:pPr>
       <w:pBdr/>
@@ -31268,10 +31385,10 @@
       <w:szCs w:val="40"/>
     </w:rPr>
   </w:style>
-  <w:style w:type="character" w:styleId="151">
+  <w:style w:type="character" w:styleId="837">
     <w:name w:val="Heading 2 Char"/>
-    <w:basedOn w:val="665"/>
-    <w:link w:val="140"/>
+    <w:basedOn w:val="888"/>
+    <w:link w:val="828"/>
     <w:uiPriority w:val="9"/>
     <w:pPr>
       <w:pBdr/>
@@ -31285,10 +31402,10 @@
       <w:szCs w:val="32"/>
     </w:rPr>
   </w:style>
-  <w:style w:type="character" w:styleId="152">
+  <w:style w:type="character" w:styleId="838">
     <w:name w:val="Heading 3 Char"/>
-    <w:basedOn w:val="665"/>
-    <w:link w:val="141"/>
+    <w:basedOn w:val="888"/>
+    <w:link w:val="829"/>
     <w:uiPriority w:val="9"/>
     <w:pPr>
       <w:pBdr/>
@@ -31302,10 +31419,10 @@
       <w:szCs w:val="28"/>
     </w:rPr>
   </w:style>
-  <w:style w:type="character" w:styleId="153">
+  <w:style w:type="character" w:styleId="839">
     <w:name w:val="Heading 4 Char"/>
-    <w:basedOn w:val="665"/>
-    <w:link w:val="142"/>
+    <w:basedOn w:val="888"/>
+    <w:link w:val="830"/>
     <w:uiPriority w:val="9"/>
     <w:pPr>
       <w:pBdr/>
@@ -31319,10 +31436,10 @@
       <w:color w:val="0f4761" w:themeColor="accent1" w:themeShade="BF"/>
     </w:rPr>
   </w:style>
-  <w:style w:type="character" w:styleId="154">
+  <w:style w:type="character" w:styleId="840">
     <w:name w:val="Heading 5 Char"/>
-    <w:basedOn w:val="665"/>
-    <w:link w:val="143"/>
+    <w:basedOn w:val="888"/>
+    <w:link w:val="831"/>
     <w:uiPriority w:val="9"/>
     <w:pPr>
       <w:pBdr/>
@@ -31334,10 +31451,10 @@
       <w:color w:val="0f4761" w:themeColor="accent1" w:themeShade="BF"/>
     </w:rPr>
   </w:style>
-  <w:style w:type="character" w:styleId="155">
+  <w:style w:type="character" w:styleId="841">
     <w:name w:val="Heading 6 Char"/>
-    <w:basedOn w:val="665"/>
-    <w:link w:val="144"/>
+    <w:basedOn w:val="888"/>
+    <w:link w:val="832"/>
     <w:uiPriority w:val="9"/>
     <w:pPr>
       <w:pBdr/>
@@ -31351,10 +31468,10 @@
       <w:color w:val="595959" w:themeColor="text1" w:themeTint="A6"/>
     </w:rPr>
   </w:style>
-  <w:style w:type="character" w:styleId="156">
+  <w:style w:type="character" w:styleId="842">
     <w:name w:val="Heading 7 Char"/>
-    <w:basedOn w:val="665"/>
-    <w:link w:val="145"/>
+    <w:basedOn w:val="888"/>
+    <w:link w:val="833"/>
     <w:uiPriority w:val="9"/>
     <w:pPr>
       <w:pBdr/>
@@ -31366,10 +31483,10 @@
       <w:color w:val="595959" w:themeColor="text1" w:themeTint="A6"/>
     </w:rPr>
   </w:style>
-  <w:style w:type="character" w:styleId="157">
+  <w:style w:type="character" w:styleId="843">
     <w:name w:val="Heading 8 Char"/>
-    <w:basedOn w:val="665"/>
-    <w:link w:val="146"/>
+    <w:basedOn w:val="888"/>
+    <w:link w:val="834"/>
     <w:uiPriority w:val="9"/>
     <w:pPr>
       <w:pBdr/>
@@ -31383,10 +31500,10 @@
       <w:color w:val="272727" w:themeColor="text1" w:themeTint="D8"/>
     </w:rPr>
   </w:style>
-  <w:style w:type="character" w:styleId="158">
+  <w:style w:type="character" w:styleId="844">
     <w:name w:val="Heading 9 Char"/>
-    <w:basedOn w:val="665"/>
-    <w:link w:val="147"/>
+    <w:basedOn w:val="888"/>
+    <w:link w:val="835"/>
     <w:uiPriority w:val="9"/>
     <w:pPr>
       <w:pBdr/>
@@ -31400,11 +31517,11 @@
       <w:color w:val="272727" w:themeColor="text1" w:themeTint="D8"/>
     </w:rPr>
   </w:style>
-  <w:style w:type="paragraph" w:styleId="159">
+  <w:style w:type="paragraph" w:styleId="845">
     <w:name w:val="Title"/>
-    <w:basedOn w:val="664"/>
-    <w:next w:val="664"/>
-    <w:link w:val="160"/>
+    <w:basedOn w:val="887"/>
+    <w:next w:val="887"/>
+    <w:link w:val="846"/>
     <w:uiPriority w:val="10"/>
     <w:qFormat/>
     <w:pPr>
@@ -31420,10 +31537,10 @@
       <w:szCs w:val="56"/>
     </w:rPr>
   </w:style>
-  <w:style w:type="character" w:styleId="160">
+  <w:style w:type="character" w:styleId="846">
     <w:name w:val="Title Char"/>
-    <w:basedOn w:val="665"/>
-    <w:link w:val="159"/>
+    <w:basedOn w:val="888"/>
+    <w:link w:val="845"/>
     <w:uiPriority w:val="10"/>
     <w:pPr>
       <w:pBdr/>
@@ -31437,11 +31554,11 @@
       <w:szCs w:val="56"/>
     </w:rPr>
   </w:style>
-  <w:style w:type="paragraph" w:styleId="161">
+  <w:style w:type="paragraph" w:styleId="847">
     <w:name w:val="Subtitle"/>
-    <w:basedOn w:val="664"/>
-    <w:next w:val="664"/>
-    <w:link w:val="162"/>
+    <w:basedOn w:val="887"/>
+    <w:next w:val="887"/>
+    <w:link w:val="848"/>
     <w:uiPriority w:val="11"/>
     <w:qFormat/>
     <w:pPr>
@@ -31459,10 +31576,10 @@
       <w:szCs w:val="28"/>
     </w:rPr>
   </w:style>
-  <w:style w:type="character" w:styleId="162">
+  <w:style w:type="character" w:styleId="848">
     <w:name w:val="Subtitle Char"/>
-    <w:basedOn w:val="665"/>
-    <w:link w:val="161"/>
+    <w:basedOn w:val="888"/>
+    <w:link w:val="847"/>
     <w:uiPriority w:val="11"/>
     <w:pPr>
       <w:pBdr/>
@@ -31476,11 +31593,11 @@
       <w:szCs w:val="28"/>
     </w:rPr>
   </w:style>
-  <w:style w:type="paragraph" w:styleId="163">
+  <w:style w:type="paragraph" w:styleId="849">
     <w:name w:val="Quote"/>
-    <w:basedOn w:val="664"/>
-    <w:next w:val="664"/>
-    <w:link w:val="164"/>
+    <w:basedOn w:val="887"/>
+    <w:next w:val="887"/>
+    <w:link w:val="850"/>
     <w:uiPriority w:val="29"/>
     <w:qFormat/>
     <w:pPr>
@@ -31495,10 +31612,10 @@
       <w:color w:val="404040" w:themeColor="text1" w:themeTint="BF"/>
     </w:rPr>
   </w:style>
-  <w:style w:type="character" w:styleId="164">
+  <w:style w:type="character" w:styleId="850">
     <w:name w:val="Quote Char"/>
-    <w:basedOn w:val="665"/>
-    <w:link w:val="163"/>
+    <w:basedOn w:val="888"/>
+    <w:link w:val="849"/>
     <w:uiPriority w:val="29"/>
     <w:pPr>
       <w:pBdr/>
@@ -31511,9 +31628,9 @@
       <w:color w:val="404040" w:themeColor="text1" w:themeTint="BF"/>
     </w:rPr>
   </w:style>
-  <w:style w:type="paragraph" w:styleId="165">
+  <w:style w:type="paragraph" w:styleId="851">
     <w:name w:val="List Paragraph"/>
-    <w:basedOn w:val="664"/>
+    <w:basedOn w:val="887"/>
     <w:uiPriority w:val="34"/>
     <w:qFormat/>
     <w:pPr>
@@ -31523,9 +31640,9 @@
       <w:contextualSpacing w:val="true"/>
     </w:pPr>
   </w:style>
-  <w:style w:type="character" w:styleId="166">
+  <w:style w:type="character" w:styleId="852">
     <w:name w:val="Intense Emphasis"/>
-    <w:basedOn w:val="665"/>
+    <w:basedOn w:val="888"/>
     <w:uiPriority w:val="21"/>
     <w:qFormat/>
     <w:pPr>
@@ -31539,11 +31656,11 @@
       <w:color w:val="0f4761" w:themeColor="accent1" w:themeShade="BF"/>
     </w:rPr>
   </w:style>
-  <w:style w:type="paragraph" w:styleId="167">
+  <w:style w:type="paragraph" w:styleId="853">
     <w:name w:val="Intense Quote"/>
-    <w:basedOn w:val="664"/>
-    <w:next w:val="664"/>
-    <w:link w:val="168"/>
+    <w:basedOn w:val="887"/>
+    <w:next w:val="887"/>
+    <w:link w:val="854"/>
     <w:uiPriority w:val="30"/>
     <w:qFormat/>
     <w:pPr>
@@ -31561,10 +31678,10 @@
       <w:color w:val="0f4761" w:themeColor="accent1" w:themeShade="BF"/>
     </w:rPr>
   </w:style>
-  <w:style w:type="character" w:styleId="168">
+  <w:style w:type="character" w:styleId="854">
     <w:name w:val="Intense Quote Char"/>
-    <w:basedOn w:val="665"/>
-    <w:link w:val="167"/>
+    <w:basedOn w:val="888"/>
+    <w:link w:val="853"/>
     <w:uiPriority w:val="30"/>
     <w:pPr>
       <w:pBdr/>
@@ -31577,9 +31694,9 @@
       <w:color w:val="0f4761" w:themeColor="accent1" w:themeShade="BF"/>
     </w:rPr>
   </w:style>
-  <w:style w:type="character" w:styleId="169">
+  <w:style w:type="character" w:styleId="855">
     <w:name w:val="Intense Reference"/>
-    <w:basedOn w:val="665"/>
+    <w:basedOn w:val="888"/>
     <w:uiPriority w:val="32"/>
     <w:qFormat/>
     <w:pPr>
@@ -31595,9 +31712,9 @@
       <w:spacing w:val="5"/>
     </w:rPr>
   </w:style>
-  <w:style w:type="paragraph" w:styleId="170">
+  <w:style w:type="paragraph" w:styleId="856">
     <w:name w:val="No Spacing"/>
-    <w:basedOn w:val="664"/>
+    <w:basedOn w:val="887"/>
     <w:uiPriority w:val="1"/>
     <w:qFormat/>
     <w:pPr>
@@ -31606,9 +31723,9 @@
       <w:ind/>
     </w:pPr>
   </w:style>
-  <w:style w:type="character" w:styleId="171">
+  <w:style w:type="character" w:styleId="857">
     <w:name w:val="Subtle Emphasis"/>
-    <w:basedOn w:val="665"/>
+    <w:basedOn w:val="888"/>
     <w:uiPriority w:val="19"/>
     <w:qFormat/>
     <w:pPr>
@@ -31622,9 +31739,9 @@
       <w:color w:val="404040" w:themeColor="text1" w:themeTint="BF"/>
     </w:rPr>
   </w:style>
-  <w:style w:type="character" w:styleId="172">
+  <w:style w:type="character" w:styleId="858">
     <w:name w:val="Emphasis"/>
-    <w:basedOn w:val="665"/>
+    <w:basedOn w:val="888"/>
     <w:uiPriority w:val="20"/>
     <w:qFormat/>
     <w:pPr>
@@ -31637,9 +31754,9 @@
       <w:iCs/>
     </w:rPr>
   </w:style>
-  <w:style w:type="character" w:styleId="173">
+  <w:style w:type="character" w:styleId="859">
     <w:name w:val="Strong"/>
-    <w:basedOn w:val="665"/>
+    <w:basedOn w:val="888"/>
     <w:uiPriority w:val="22"/>
     <w:qFormat/>
     <w:pPr>
@@ -31652,9 +31769,9 @@
       <w:bCs/>
     </w:rPr>
   </w:style>
-  <w:style w:type="character" w:styleId="174">
+  <w:style w:type="character" w:styleId="860">
     <w:name w:val="Subtle Reference"/>
-    <w:basedOn w:val="665"/>
+    <w:basedOn w:val="888"/>
     <w:uiPriority w:val="31"/>
     <w:qFormat/>
     <w:pPr>
@@ -31667,9 +31784,9 @@
       <w:color w:val="5a5a5a" w:themeColor="text1" w:themeTint="A5"/>
     </w:rPr>
   </w:style>
-  <w:style w:type="character" w:styleId="175">
+  <w:style w:type="character" w:styleId="861">
     <w:name w:val="Book Title"/>
-    <w:basedOn w:val="665"/>
+    <w:basedOn w:val="888"/>
     <w:uiPriority w:val="33"/>
     <w:qFormat/>
     <w:pPr>
@@ -31685,10 +31802,10 @@
       <w:spacing w:val="5"/>
     </w:rPr>
   </w:style>
-  <w:style w:type="paragraph" w:styleId="176">
+  <w:style w:type="paragraph" w:styleId="862">
     <w:name w:val="Header"/>
-    <w:basedOn w:val="664"/>
-    <w:link w:val="177"/>
+    <w:basedOn w:val="887"/>
+    <w:link w:val="863"/>
     <w:uiPriority w:val="99"/>
     <w:unhideWhenUsed/>
     <w:pPr>
@@ -31701,10 +31818,10 @@
       <w:ind/>
     </w:pPr>
   </w:style>
-  <w:style w:type="character" w:styleId="177">
+  <w:style w:type="character" w:styleId="863">
     <w:name w:val="Header Char"/>
-    <w:basedOn w:val="665"/>
-    <w:link w:val="176"/>
+    <w:basedOn w:val="888"/>
+    <w:link w:val="862"/>
     <w:uiPriority w:val="99"/>
     <w:pPr>
       <w:pBdr/>
@@ -31712,10 +31829,10 @@
       <w:ind/>
     </w:pPr>
   </w:style>
-  <w:style w:type="paragraph" w:styleId="178">
+  <w:style w:type="paragraph" w:styleId="864">
     <w:name w:val="Footer"/>
-    <w:basedOn w:val="664"/>
-    <w:link w:val="179"/>
+    <w:basedOn w:val="887"/>
+    <w:link w:val="865"/>
     <w:uiPriority w:val="99"/>
     <w:unhideWhenUsed/>
     <w:pPr>
@@ -31728,10 +31845,10 @@
       <w:ind/>
     </w:pPr>
   </w:style>
-  <w:style w:type="character" w:styleId="179">
+  <w:style w:type="character" w:styleId="865">
     <w:name w:val="Footer Char"/>
-    <w:basedOn w:val="665"/>
-    <w:link w:val="178"/>
+    <w:basedOn w:val="888"/>
+    <w:link w:val="864"/>
     <w:uiPriority w:val="99"/>
     <w:pPr>
       <w:pBdr/>
@@ -31739,10 +31856,10 @@
       <w:ind/>
     </w:pPr>
   </w:style>
-  <w:style w:type="paragraph" w:styleId="180">
+  <w:style w:type="paragraph" w:styleId="866">
     <w:name w:val="Caption"/>
-    <w:basedOn w:val="664"/>
-    <w:next w:val="664"/>
+    <w:basedOn w:val="887"/>
+    <w:next w:val="887"/>
     <w:uiPriority w:val="35"/>
     <w:unhideWhenUsed/>
     <w:qFormat/>
@@ -31759,10 +31876,10 @@
       <w:szCs w:val="18"/>
     </w:rPr>
   </w:style>
-  <w:style w:type="paragraph" w:styleId="181">
+  <w:style w:type="paragraph" w:styleId="867">
     <w:name w:val="footnote text"/>
-    <w:basedOn w:val="664"/>
-    <w:link w:val="182"/>
+    <w:basedOn w:val="887"/>
+    <w:link w:val="868"/>
     <w:uiPriority w:val="99"/>
     <w:semiHidden/>
     <w:unhideWhenUsed/>
@@ -31776,10 +31893,10 @@
       <w:szCs w:val="20"/>
     </w:rPr>
   </w:style>
-  <w:style w:type="character" w:styleId="182">
+  <w:style w:type="character" w:styleId="868">
     <w:name w:val="Footnote Text Char"/>
-    <w:basedOn w:val="665"/>
-    <w:link w:val="181"/>
+    <w:basedOn w:val="888"/>
+    <w:link w:val="867"/>
     <w:uiPriority w:val="99"/>
     <w:semiHidden/>
     <w:pPr>
@@ -31792,9 +31909,9 @@
       <w:szCs w:val="20"/>
     </w:rPr>
   </w:style>
-  <w:style w:type="character" w:styleId="183">
+  <w:style w:type="character" w:styleId="869">
     <w:name w:val="footnote reference"/>
-    <w:basedOn w:val="665"/>
+    <w:basedOn w:val="888"/>
     <w:uiPriority w:val="99"/>
     <w:semiHidden/>
     <w:unhideWhenUsed/>
@@ -31807,10 +31924,10 @@
       <w:vertAlign w:val="superscript"/>
     </w:rPr>
   </w:style>
-  <w:style w:type="paragraph" w:styleId="184">
+  <w:style w:type="paragraph" w:styleId="870">
     <w:name w:val="endnote text"/>
-    <w:basedOn w:val="664"/>
-    <w:link w:val="185"/>
+    <w:basedOn w:val="887"/>
+    <w:link w:val="871"/>
     <w:uiPriority w:val="99"/>
     <w:semiHidden/>
     <w:unhideWhenUsed/>
@@ -31824,10 +31941,10 @@
       <w:szCs w:val="20"/>
     </w:rPr>
   </w:style>
-  <w:style w:type="character" w:styleId="185">
+  <w:style w:type="character" w:styleId="871">
     <w:name w:val="Endnote Text Char"/>
-    <w:basedOn w:val="665"/>
-    <w:link w:val="184"/>
+    <w:basedOn w:val="888"/>
+    <w:link w:val="870"/>
     <w:uiPriority w:val="99"/>
     <w:semiHidden/>
     <w:pPr>
@@ -31840,9 +31957,9 @@
       <w:szCs w:val="20"/>
     </w:rPr>
   </w:style>
-  <w:style w:type="character" w:styleId="186">
+  <w:style w:type="character" w:styleId="872">
     <w:name w:val="endnote reference"/>
-    <w:basedOn w:val="665"/>
+    <w:basedOn w:val="888"/>
     <w:uiPriority w:val="99"/>
     <w:semiHidden/>
     <w:unhideWhenUsed/>
@@ -31855,9 +31972,9 @@
       <w:vertAlign w:val="superscript"/>
     </w:rPr>
   </w:style>
-  <w:style w:type="character" w:styleId="187">
+  <w:style w:type="character" w:styleId="873">
     <w:name w:val="Hyperlink"/>
-    <w:basedOn w:val="665"/>
+    <w:basedOn w:val="888"/>
     <w:uiPriority w:val="99"/>
     <w:unhideWhenUsed/>
     <w:pPr>
@@ -31870,9 +31987,9 @@
       <w:u w:val="single"/>
     </w:rPr>
   </w:style>
-  <w:style w:type="character" w:styleId="188">
+  <w:style w:type="character" w:styleId="874">
     <w:name w:val="FollowedHyperlink"/>
-    <w:basedOn w:val="665"/>
+    <w:basedOn w:val="888"/>
     <w:uiPriority w:val="99"/>
     <w:semiHidden/>
     <w:unhideWhenUsed/>
@@ -31886,10 +32003,10 @@
       <w:u w:val="single"/>
     </w:rPr>
   </w:style>
-  <w:style w:type="paragraph" w:styleId="189">
+  <w:style w:type="paragraph" w:styleId="875">
     <w:name w:val="toc 1"/>
-    <w:basedOn w:val="664"/>
-    <w:next w:val="664"/>
+    <w:basedOn w:val="887"/>
+    <w:next w:val="887"/>
     <w:uiPriority w:val="39"/>
     <w:unhideWhenUsed/>
     <w:pPr>
@@ -31898,10 +32015,10 @@
       <w:ind/>
     </w:pPr>
   </w:style>
-  <w:style w:type="paragraph" w:styleId="190">
+  <w:style w:type="paragraph" w:styleId="876">
     <w:name w:val="toc 2"/>
-    <w:basedOn w:val="664"/>
-    <w:next w:val="664"/>
+    <w:basedOn w:val="887"/>
+    <w:next w:val="887"/>
     <w:uiPriority w:val="39"/>
     <w:unhideWhenUsed/>
     <w:pPr>
@@ -31910,10 +32027,10 @@
       <w:ind w:left="220"/>
     </w:pPr>
   </w:style>
-  <w:style w:type="paragraph" w:styleId="191">
+  <w:style w:type="paragraph" w:styleId="877">
     <w:name w:val="toc 3"/>
-    <w:basedOn w:val="664"/>
-    <w:next w:val="664"/>
+    <w:basedOn w:val="887"/>
+    <w:next w:val="887"/>
     <w:uiPriority w:val="39"/>
     <w:unhideWhenUsed/>
     <w:pPr>
@@ -31922,10 +32039,10 @@
       <w:ind w:left="440"/>
     </w:pPr>
   </w:style>
-  <w:style w:type="paragraph" w:styleId="192">
+  <w:style w:type="paragraph" w:styleId="878">
     <w:name w:val="toc 4"/>
-    <w:basedOn w:val="664"/>
-    <w:next w:val="664"/>
+    <w:basedOn w:val="887"/>
+    <w:next w:val="887"/>
     <w:uiPriority w:val="39"/>
     <w:unhideWhenUsed/>
     <w:pPr>
@@ -31934,10 +32051,10 @@
       <w:ind w:left="660"/>
     </w:pPr>
   </w:style>
-  <w:style w:type="paragraph" w:styleId="193">
+  <w:style w:type="paragraph" w:styleId="879">
     <w:name w:val="toc 5"/>
-    <w:basedOn w:val="664"/>
-    <w:next w:val="664"/>
+    <w:basedOn w:val="887"/>
+    <w:next w:val="887"/>
     <w:uiPriority w:val="39"/>
     <w:unhideWhenUsed/>
     <w:pPr>
@@ -31946,10 +32063,10 @@
       <w:ind w:left="880"/>
     </w:pPr>
   </w:style>
-  <w:style w:type="paragraph" w:styleId="194">
+  <w:style w:type="paragraph" w:styleId="880">
     <w:name w:val="toc 6"/>
-    <w:basedOn w:val="664"/>
-    <w:next w:val="664"/>
+    <w:basedOn w:val="887"/>
+    <w:next w:val="887"/>
     <w:uiPriority w:val="39"/>
     <w:unhideWhenUsed/>
     <w:pPr>
@@ -31958,10 +32075,10 @@
       <w:ind w:left="1100"/>
     </w:pPr>
   </w:style>
-  <w:style w:type="paragraph" w:styleId="195">
+  <w:style w:type="paragraph" w:styleId="881">
     <w:name w:val="toc 7"/>
-    <w:basedOn w:val="664"/>
-    <w:next w:val="664"/>
+    <w:basedOn w:val="887"/>
+    <w:next w:val="887"/>
     <w:uiPriority w:val="39"/>
     <w:unhideWhenUsed/>
     <w:pPr>
@@ -31970,10 +32087,10 @@
       <w:ind w:left="1320"/>
     </w:pPr>
   </w:style>
-  <w:style w:type="paragraph" w:styleId="196">
+  <w:style w:type="paragraph" w:styleId="882">
     <w:name w:val="toc 8"/>
-    <w:basedOn w:val="664"/>
-    <w:next w:val="664"/>
+    <w:basedOn w:val="887"/>
+    <w:next w:val="887"/>
     <w:uiPriority w:val="39"/>
     <w:unhideWhenUsed/>
     <w:pPr>
@@ -31982,10 +32099,10 @@
       <w:ind w:left="1540"/>
     </w:pPr>
   </w:style>
-  <w:style w:type="paragraph" w:styleId="197">
+  <w:style w:type="paragraph" w:styleId="883">
     <w:name w:val="toc 9"/>
-    <w:basedOn w:val="664"/>
-    <w:next w:val="664"/>
+    <w:basedOn w:val="887"/>
+    <w:next w:val="887"/>
     <w:uiPriority w:val="39"/>
     <w:unhideWhenUsed/>
     <w:pPr>
@@ -31994,9 +32111,9 @@
       <w:ind w:left="1760"/>
     </w:pPr>
   </w:style>
-  <w:style w:type="character" w:styleId="198">
+  <w:style w:type="character" w:styleId="884">
     <w:name w:val="Placeholder Text"/>
-    <w:basedOn w:val="665"/>
+    <w:basedOn w:val="888"/>
     <w:uiPriority w:val="99"/>
     <w:semiHidden/>
     <w:pPr>
@@ -32008,7 +32125,7 @@
       <w:color w:val="666666"/>
     </w:rPr>
   </w:style>
-  <w:style w:type="paragraph" w:styleId="208">
+  <w:style w:type="paragraph" w:styleId="885">
     <w:name w:val="TOC Heading"/>
     <w:uiPriority w:val="39"/>
     <w:unhideWhenUsed/>
@@ -32018,10 +32135,10 @@
       <w:ind/>
     </w:pPr>
   </w:style>
-  <w:style w:type="paragraph" w:styleId="209">
+  <w:style w:type="paragraph" w:styleId="886">
     <w:name w:val="table of figures"/>
-    <w:basedOn w:val="664"/>
-    <w:next w:val="664"/>
+    <w:basedOn w:val="887"/>
+    <w:next w:val="887"/>
     <w:uiPriority w:val="99"/>
     <w:unhideWhenUsed/>
     <w:pPr>
@@ -32030,7 +32147,7 @@
       <w:ind/>
     </w:pPr>
   </w:style>
-  <w:style w:type="paragraph" w:styleId="664" w:default="1">
+  <w:style w:type="paragraph" w:styleId="887" w:default="1">
     <w:name w:val="Normal"/>
     <w:qFormat/>
     <w:pPr>
@@ -32044,7 +32161,7 @@
       <w:lang w:eastAsia="zh-CN"/>
     </w:rPr>
   </w:style>
-  <w:style w:type="character" w:styleId="665" w:default="1">
+  <w:style w:type="character" w:styleId="888" w:default="1">
     <w:name w:val="Default Paragraph Font"/>
     <w:uiPriority w:val="1"/>
     <w:semiHidden/>
@@ -32055,7 +32172,7 @@
       <w:ind/>
     </w:pPr>
   </w:style>
-  <w:style w:type="table" w:styleId="666" w:default="1">
+  <w:style w:type="table" w:styleId="889" w:default="1">
     <w:name w:val="Normal Table"/>
     <w:uiPriority w:val="99"/>
     <w:semiHidden/>
@@ -32248,7 +32365,7 @@
       </w:tcPr>
     </w:tblStylePr>
   </w:style>
-  <w:style w:type="numbering" w:styleId="667" w:default="1">
+  <w:style w:type="numbering" w:styleId="890" w:default="1">
     <w:name w:val="No List"/>
     <w:uiPriority w:val="99"/>
     <w:semiHidden/>
@@ -32259,9 +32376,9 @@
       <w:ind/>
     </w:pPr>
   </w:style>
-  <w:style w:type="paragraph" w:styleId="668">
+  <w:style w:type="paragraph" w:styleId="891">
     <w:name w:val="Normal (Web)"/>
-    <w:basedOn w:val="664"/>
+    <w:basedOn w:val="887"/>
     <w:pPr>
       <w:pBdr/>
       <w:spacing w:after="100" w:afterAutospacing="1" w:before="100" w:beforeAutospacing="1"/>

</xml_diff>